<commit_message>
Update 2.6_GuiaEstudiante_Fase 2_Informe Final Proyecto APT.docx
</commit_message>
<xml_diff>
--- a/Fase 2/Evidencias Grupales/2.6_GuiaEstudiante_Fase 2_Informe Final Proyecto APT.docx
+++ b/Fase 2/Evidencias Grupales/2.6_GuiaEstudiante_Fase 2_Informe Final Proyecto APT.docx
@@ -1,6 +1,6 @@
 
 <file path=word/document.xml><?xml version="1.0" encoding="utf-8"?>
-<w:document xmlns:wpc="http://schemas.microsoft.com/office/word/2010/wordprocessingCanvas" xmlns:cx="http://schemas.microsoft.com/office/drawing/2014/chartex" xmlns:mc="http://schemas.openxmlformats.org/markup-compatibility/2006" xmlns:o="urn:schemas-microsoft-com:office:office" xmlns:r="http://schemas.openxmlformats.org/officeDocument/2006/relationships" xmlns:m="http://schemas.openxmlformats.org/officeDocument/2006/math" xmlns:v="urn:schemas-microsoft-com:vml" xmlns:wp14="http://schemas.microsoft.com/office/word/2010/wordprocessingDrawing" xmlns:wp="http://schemas.openxmlformats.org/drawingml/2006/wordprocessingDrawing" xmlns:w10="urn:schemas-microsoft-com:office:word" xmlns:w="http://schemas.openxmlformats.org/wordprocessingml/2006/main" xmlns:w14="http://schemas.microsoft.com/office/word/2010/wordml" xmlns:w15="http://schemas.microsoft.com/office/word/2012/wordml" xmlns:w16se="http://schemas.microsoft.com/office/word/2015/wordml/symex" xmlns:wpg="http://schemas.microsoft.com/office/word/2010/wordprocessingGroup" xmlns:wpi="http://schemas.microsoft.com/office/word/2010/wordprocessingInk" xmlns:wne="http://schemas.microsoft.com/office/word/2006/wordml" xmlns:wps="http://schemas.microsoft.com/office/word/2010/wordprocessingShape" mc:Ignorable="w14 w15 w16se wp14">
+<w:document xmlns:wpc="http://schemas.microsoft.com/office/word/2010/wordprocessingCanvas" xmlns:cx="http://schemas.microsoft.com/office/drawing/2014/chartex" xmlns:cx1="http://schemas.microsoft.com/office/drawing/2015/9/8/chartex" xmlns:cx2="http://schemas.microsoft.com/office/drawing/2015/10/21/chartex" xmlns:cx3="http://schemas.microsoft.com/office/drawing/2016/5/9/chartex" xmlns:cx4="http://schemas.microsoft.com/office/drawing/2016/5/10/chartex" xmlns:cx5="http://schemas.microsoft.com/office/drawing/2016/5/11/chartex" xmlns:cx6="http://schemas.microsoft.com/office/drawing/2016/5/12/chartex" xmlns:cx7="http://schemas.microsoft.com/office/drawing/2016/5/13/chartex" xmlns:cx8="http://schemas.microsoft.com/office/drawing/2016/5/14/chartex" xmlns:mc="http://schemas.openxmlformats.org/markup-compatibility/2006" xmlns:aink="http://schemas.microsoft.com/office/drawing/2016/ink" xmlns:am3d="http://schemas.microsoft.com/office/drawing/2017/model3d" xmlns:o="urn:schemas-microsoft-com:office:office" xmlns:oel="http://schemas.microsoft.com/office/2019/extlst" xmlns:r="http://schemas.openxmlformats.org/officeDocument/2006/relationships" xmlns:m="http://schemas.openxmlformats.org/officeDocument/2006/math" xmlns:v="urn:schemas-microsoft-com:vml" xmlns:wp14="http://schemas.microsoft.com/office/word/2010/wordprocessingDrawing" xmlns:wp="http://schemas.openxmlformats.org/drawingml/2006/wordprocessingDrawing" xmlns:w10="urn:schemas-microsoft-com:office:word" xmlns:w="http://schemas.openxmlformats.org/wordprocessingml/2006/main" xmlns:w14="http://schemas.microsoft.com/office/word/2010/wordml" xmlns:w15="http://schemas.microsoft.com/office/word/2012/wordml" xmlns:w16cex="http://schemas.microsoft.com/office/word/2018/wordml/cex" xmlns:w16cid="http://schemas.microsoft.com/office/word/2016/wordml/cid" xmlns:w16="http://schemas.microsoft.com/office/word/2018/wordml" xmlns:w16du="http://schemas.microsoft.com/office/word/2023/wordml/word16du" xmlns:w16sdtdh="http://schemas.microsoft.com/office/word/2020/wordml/sdtdatahash" xmlns:w16sdtfl="http://schemas.microsoft.com/office/word/2024/wordml/sdtformatlock" xmlns:w16se="http://schemas.microsoft.com/office/word/2015/wordml/symex" xmlns:wpg="http://schemas.microsoft.com/office/word/2010/wordprocessingGroup" xmlns:wpi="http://schemas.microsoft.com/office/word/2010/wordprocessingInk" xmlns:wne="http://schemas.microsoft.com/office/word/2006/wordml" xmlns:wps="http://schemas.microsoft.com/office/word/2010/wordprocessingShape" mc:Ignorable="w14 w15 w16se w16cid w16 w16cex w16sdtdh w16sdtfl w16du wp14">
   <w:body>
     <w:p>
       <w:r>
@@ -165,6 +165,7 @@
                                 </w:rPr>
                                 <w:t xml:space="preserve">Asignatura </w:t>
                               </w:r>
+                              <w:proofErr w:type="spellStart"/>
                               <w:r>
                                 <w:rPr>
                                   <w:b/>
@@ -174,8 +175,7 @@
                                 </w:rPr>
                                 <w:t>Capstone</w:t>
                               </w:r>
-                              <w:bookmarkStart w:id="0" w:name="_GoBack"/>
-                              <w:bookmarkEnd w:id="0"/>
+                              <w:proofErr w:type="spellEnd"/>
                             </w:p>
                           </w:txbxContent>
                         </wps:txbx>
@@ -240,7 +240,7 @@
           </mc:Choice>
           <mc:Fallback>
             <w:pict>
-              <v:group w14:anchorId="7466F1C2" id="Grupo 53" o:spid="_x0000_s1026" style="position:absolute;margin-left:-24.7pt;margin-top:3pt;width:491.25pt;height:123pt;z-index:251659264;mso-position-horizontal-relative:margin;mso-width-relative:margin;mso-height-relative:margin" coordsize="59912,15621" o:gfxdata="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">
+              <v:group w14:anchorId="7466F1C2" id="Grupo 53" o:spid="_x0000_s1026" style="position:absolute;margin-left:-24.7pt;margin-top:3pt;width:491.25pt;height:123pt;z-index:251659264;mso-position-horizontal-relative:margin;mso-width-relative:margin;mso-height-relative:margin" coordsize="59912,15621" o:gfxdata="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">
                 <v:shapetype id="_x0000_t202" coordsize="21600,21600" o:spt="202" path="m,l,21600r21600,l21600,xe">
                   <v:stroke joinstyle="miter"/>
                   <v:path gradientshapeok="t" o:connecttype="rect"/>
@@ -352,6 +352,7 @@
                           </w:rPr>
                           <w:t xml:space="preserve">Asignatura </w:t>
                         </w:r>
+                        <w:proofErr w:type="spellStart"/>
                         <w:r>
                           <w:rPr>
                             <w:b/>
@@ -361,8 +362,7 @@
                           </w:rPr>
                           <w:t>Capstone</w:t>
                         </w:r>
-                        <w:bookmarkStart w:id="1" w:name="_GoBack"/>
-                        <w:bookmarkEnd w:id="1"/>
+                        <w:proofErr w:type="spellEnd"/>
                       </w:p>
                     </w:txbxContent>
                   </v:textbox>
@@ -708,17 +708,14 @@
                 <w:b/>
               </w:rPr>
             </w:pPr>
-            <w:r>
-              <w:rPr>
-                <w:rFonts w:ascii="Calibri" w:hAnsi="Calibri" w:cs="Arial"/>
-                <w:i/>
-                <w:color w:val="548DD4"/>
-                <w:sz w:val="20"/>
-                <w:szCs w:val="20"/>
-                <w:lang w:eastAsia="es-CL"/>
-              </w:rPr>
-              <w:t>Escribe el nombre de tu Proyecto APT.</w:t>
-            </w:r>
+            <w:proofErr w:type="spellStart"/>
+            <w:r>
+              <w:rPr>
+                <w:bCs/>
+              </w:rPr>
+              <w:t>ServiMatch</w:t>
+            </w:r>
+            <w:proofErr w:type="spellEnd"/>
           </w:p>
         </w:tc>
       </w:tr>
@@ -760,36 +757,9 @@
             </w:pPr>
             <w:r>
               <w:rPr>
-                <w:rFonts w:ascii="Calibri" w:hAnsi="Calibri" w:cs="Arial"/>
-                <w:i/>
-                <w:color w:val="548DD4"/>
-                <w:sz w:val="20"/>
-                <w:szCs w:val="20"/>
-                <w:lang w:eastAsia="es-CL"/>
-              </w:rPr>
-              <w:t xml:space="preserve">Menciona la(s) área(s) de desempeño de tu Plan de Estudio que </w:t>
-            </w:r>
-            <w:r>
-              <w:rPr>
-                <w:rFonts w:ascii="Calibri" w:hAnsi="Calibri" w:cs="Arial"/>
-                <w:i/>
-                <w:color w:val="548DD4"/>
-                <w:sz w:val="20"/>
-                <w:szCs w:val="20"/>
-                <w:lang w:eastAsia="es-CL"/>
-              </w:rPr>
-              <w:t xml:space="preserve">abordaron </w:t>
-            </w:r>
-            <w:r>
-              <w:rPr>
-                <w:rFonts w:ascii="Calibri" w:hAnsi="Calibri" w:cs="Arial"/>
-                <w:i/>
-                <w:color w:val="548DD4"/>
-                <w:sz w:val="20"/>
-                <w:szCs w:val="20"/>
-                <w:lang w:eastAsia="es-CL"/>
-              </w:rPr>
-              <w:t>tu Proyecto APT.</w:t>
+                <w:bCs/>
+              </w:rPr>
+              <w:t>Desarrollo de Software, Gestión de Proyectos TI, Bases de Datos y Aseguramiento de Calidad de Software.</w:t>
             </w:r>
           </w:p>
         </w:tc>
@@ -834,43 +804,35 @@
           </w:tcPr>
           <w:p>
             <w:pPr>
+              <w:numPr>
+                <w:ilvl w:val="0"/>
+                <w:numId w:val="7"/>
+              </w:numPr>
+              <w:rPr>
+                <w:rFonts w:ascii="Calibri" w:hAnsi="Calibri" w:cs="Arial"/>
+                <w:color w:val="44546A" w:themeColor="text2"/>
+                <w:sz w:val="20"/>
+                <w:szCs w:val="20"/>
+                <w:lang w:eastAsia="es-CL"/>
+              </w:rPr>
+            </w:pPr>
+            <w:r>
+              <w:rPr>
+                <w:rFonts w:ascii="Calibri" w:hAnsi="Calibri" w:cs="Arial"/>
+                <w:color w:val="44546A" w:themeColor="text2"/>
+                <w:sz w:val="20"/>
+                <w:szCs w:val="20"/>
+                <w:lang w:eastAsia="es-CL"/>
+              </w:rPr>
+              <w:t>Desarrollar proyectos de software innovadores para plataformas y dispositivos móviles, por medio de marcos de trabajo, herramientas de desarrollo, lenguajes de programación y buenas prácticas de la industria del desarrollo de software</w:t>
+            </w:r>
+          </w:p>
+          <w:p>
+            <w:pPr>
               <w:rPr>
                 <w:b/>
               </w:rPr>
             </w:pPr>
-            <w:r>
-              <w:rPr>
-                <w:rFonts w:ascii="Calibri" w:hAnsi="Calibri" w:cs="Arial"/>
-                <w:i/>
-                <w:color w:val="548DD4"/>
-                <w:sz w:val="20"/>
-                <w:szCs w:val="20"/>
-                <w:lang w:eastAsia="es-CL"/>
-              </w:rPr>
-              <w:t xml:space="preserve">Menciona las competencias  de tu Plan de Estudio que </w:t>
-            </w:r>
-            <w:r>
-              <w:rPr>
-                <w:rFonts w:ascii="Calibri" w:hAnsi="Calibri" w:cs="Arial"/>
-                <w:i/>
-                <w:color w:val="548DD4"/>
-                <w:sz w:val="20"/>
-                <w:szCs w:val="20"/>
-                <w:lang w:eastAsia="es-CL"/>
-              </w:rPr>
-              <w:t>abordaste e</w:t>
-            </w:r>
-            <w:r>
-              <w:rPr>
-                <w:rFonts w:ascii="Calibri" w:hAnsi="Calibri" w:cs="Arial"/>
-                <w:i/>
-                <w:color w:val="548DD4"/>
-                <w:sz w:val="20"/>
-                <w:szCs w:val="20"/>
-                <w:lang w:eastAsia="es-CL"/>
-              </w:rPr>
-              <w:t>n tu Proyecto APT.</w:t>
-            </w:r>
           </w:p>
         </w:tc>
       </w:tr>
@@ -992,6 +954,249 @@
           <w:p>
             <w:pPr>
               <w:pStyle w:val="paragraph"/>
+              <w:spacing w:before="0" w:beforeAutospacing="0" w:after="0" w:afterAutospacing="0"/>
+              <w:jc w:val="both"/>
+              <w:textAlignment w:val="baseline"/>
+              <w:rPr>
+                <w:rFonts w:ascii="Segoe UI" w:hAnsi="Segoe UI" w:cs="Segoe UI"/>
+                <w:sz w:val="18"/>
+                <w:szCs w:val="18"/>
+              </w:rPr>
+            </w:pPr>
+            <w:r>
+              <w:rPr>
+                <w:rFonts w:ascii="Segoe UI" w:hAnsi="Segoe UI" w:cs="Segoe UI"/>
+                <w:sz w:val="18"/>
+                <w:szCs w:val="18"/>
+              </w:rPr>
+              <w:t xml:space="preserve">El proyecto </w:t>
+            </w:r>
+            <w:proofErr w:type="spellStart"/>
+            <w:r>
+              <w:rPr>
+                <w:rFonts w:ascii="Segoe UI" w:hAnsi="Segoe UI" w:cs="Segoe UI"/>
+                <w:sz w:val="18"/>
+                <w:szCs w:val="18"/>
+              </w:rPr>
+              <w:t>ServiMatch</w:t>
+            </w:r>
+            <w:proofErr w:type="spellEnd"/>
+            <w:r>
+              <w:rPr>
+                <w:rFonts w:ascii="Segoe UI" w:hAnsi="Segoe UI" w:cs="Segoe UI"/>
+                <w:sz w:val="18"/>
+                <w:szCs w:val="18"/>
+              </w:rPr>
+              <w:t xml:space="preserve"> surge de la necesidad de facilitar la búsqueda y contratación de servicios ofrecidos por trabajadores independientes, especialmente aquellos que cuentan con menor visibilidad en plataformas digitales, como zapateros, gasfíteres, electricistas, carpinteros y otros prestadores de servicios.</w:t>
+            </w:r>
+          </w:p>
+          <w:p>
+            <w:pPr>
+              <w:pStyle w:val="paragraph"/>
+              <w:spacing w:before="0" w:beforeAutospacing="0" w:after="0" w:afterAutospacing="0"/>
+              <w:jc w:val="both"/>
+              <w:textAlignment w:val="baseline"/>
+              <w:rPr>
+                <w:rFonts w:ascii="Segoe UI" w:hAnsi="Segoe UI" w:cs="Segoe UI"/>
+                <w:sz w:val="18"/>
+                <w:szCs w:val="18"/>
+              </w:rPr>
+            </w:pPr>
+          </w:p>
+          <w:p>
+            <w:pPr>
+              <w:pStyle w:val="paragraph"/>
+              <w:spacing w:before="0" w:beforeAutospacing="0" w:after="0" w:afterAutospacing="0"/>
+              <w:jc w:val="both"/>
+              <w:textAlignment w:val="baseline"/>
+              <w:rPr>
+                <w:rFonts w:ascii="Segoe UI" w:hAnsi="Segoe UI" w:cs="Segoe UI"/>
+                <w:sz w:val="18"/>
+                <w:szCs w:val="18"/>
+              </w:rPr>
+            </w:pPr>
+            <w:r>
+              <w:rPr>
+                <w:rFonts w:ascii="Segoe UI" w:hAnsi="Segoe UI" w:cs="Segoe UI"/>
+                <w:sz w:val="18"/>
+                <w:szCs w:val="18"/>
+              </w:rPr>
+              <w:t>La solución está orientada inicialmente al mercado chileno, considerando Santiago de Chile como punto de partida. Su propósito es conectar a clientes que necesitan contratar servicios con trabajadores independientes que buscan ofrecer sus habilidades y generar oportunidades laborales.</w:t>
+            </w:r>
+          </w:p>
+          <w:p>
+            <w:pPr>
+              <w:pStyle w:val="paragraph"/>
+              <w:spacing w:before="0" w:beforeAutospacing="0" w:after="0" w:afterAutospacing="0"/>
+              <w:jc w:val="both"/>
+              <w:textAlignment w:val="baseline"/>
+              <w:rPr>
+                <w:rFonts w:ascii="Segoe UI" w:hAnsi="Segoe UI" w:cs="Segoe UI"/>
+                <w:sz w:val="18"/>
+                <w:szCs w:val="18"/>
+              </w:rPr>
+            </w:pPr>
+          </w:p>
+          <w:p>
+            <w:pPr>
+              <w:pStyle w:val="paragraph"/>
+              <w:spacing w:before="0" w:beforeAutospacing="0" w:after="0" w:afterAutospacing="0"/>
+              <w:jc w:val="both"/>
+              <w:textAlignment w:val="baseline"/>
+              <w:rPr>
+                <w:rFonts w:ascii="Segoe UI" w:hAnsi="Segoe UI" w:cs="Segoe UI"/>
+                <w:sz w:val="18"/>
+                <w:szCs w:val="18"/>
+              </w:rPr>
+            </w:pPr>
+            <w:proofErr w:type="spellStart"/>
+            <w:r>
+              <w:rPr>
+                <w:rFonts w:ascii="Segoe UI" w:hAnsi="Segoe UI" w:cs="Segoe UI"/>
+                <w:sz w:val="18"/>
+                <w:szCs w:val="18"/>
+              </w:rPr>
+              <w:t>ServiMatch</w:t>
+            </w:r>
+            <w:proofErr w:type="spellEnd"/>
+            <w:r>
+              <w:rPr>
+                <w:rFonts w:ascii="Segoe UI" w:hAnsi="Segoe UI" w:cs="Segoe UI"/>
+                <w:sz w:val="18"/>
+                <w:szCs w:val="18"/>
+              </w:rPr>
+              <w:t xml:space="preserve"> propone una aplicación móvil que permita consultar servicios, revisar información de los trabajadores, gestionar solicitudes de contratación y coordinar las distintas etapas de un servicio desde una misma plataforma.</w:t>
+            </w:r>
+          </w:p>
+          <w:p>
+            <w:pPr>
+              <w:pStyle w:val="paragraph"/>
+              <w:spacing w:before="0" w:beforeAutospacing="0" w:after="0" w:afterAutospacing="0"/>
+              <w:jc w:val="both"/>
+              <w:textAlignment w:val="baseline"/>
+              <w:rPr>
+                <w:rFonts w:ascii="Segoe UI" w:hAnsi="Segoe UI" w:cs="Segoe UI"/>
+                <w:sz w:val="18"/>
+                <w:szCs w:val="18"/>
+              </w:rPr>
+            </w:pPr>
+          </w:p>
+          <w:p>
+            <w:pPr>
+              <w:pStyle w:val="paragraph"/>
+              <w:spacing w:before="0" w:beforeAutospacing="0" w:after="0" w:afterAutospacing="0"/>
+              <w:jc w:val="both"/>
+              <w:textAlignment w:val="baseline"/>
+              <w:rPr>
+                <w:rFonts w:ascii="Segoe UI" w:hAnsi="Segoe UI" w:cs="Segoe UI"/>
+                <w:sz w:val="18"/>
+                <w:szCs w:val="18"/>
+              </w:rPr>
+            </w:pPr>
+            <w:r>
+              <w:rPr>
+                <w:rFonts w:ascii="Segoe UI" w:hAnsi="Segoe UI" w:cs="Segoe UI"/>
+                <w:sz w:val="18"/>
+                <w:szCs w:val="18"/>
+              </w:rPr>
+              <w:t xml:space="preserve">El proyecto es relevante para el área de Ingeniería en Informática, ya que aborda una necesidad mediante el desarrollo de una solución tecnológica que integra una </w:t>
+            </w:r>
+            <w:r>
+              <w:rPr>
+                <w:rFonts w:ascii="Segoe UI" w:hAnsi="Segoe UI" w:cs="Segoe UI"/>
+                <w:sz w:val="18"/>
+                <w:szCs w:val="18"/>
+              </w:rPr>
+              <w:lastRenderedPageBreak/>
+              <w:t xml:space="preserve">aplicación móvil, una API </w:t>
+            </w:r>
+            <w:proofErr w:type="spellStart"/>
+            <w:r>
+              <w:rPr>
+                <w:rFonts w:ascii="Segoe UI" w:hAnsi="Segoe UI" w:cs="Segoe UI"/>
+                <w:sz w:val="18"/>
+                <w:szCs w:val="18"/>
+              </w:rPr>
+              <w:t>backend</w:t>
+            </w:r>
+            <w:proofErr w:type="spellEnd"/>
+            <w:r>
+              <w:rPr>
+                <w:rFonts w:ascii="Segoe UI" w:hAnsi="Segoe UI" w:cs="Segoe UI"/>
+                <w:sz w:val="18"/>
+                <w:szCs w:val="18"/>
+              </w:rPr>
+              <w:t xml:space="preserve"> y una base de datos. Además, contempla mecanismos de autenticación, gestión de información e integración con servicios externos, como Mercado Pago en un entorno de pruebas.</w:t>
+            </w:r>
+          </w:p>
+          <w:p>
+            <w:pPr>
+              <w:pStyle w:val="paragraph"/>
+              <w:spacing w:before="0" w:beforeAutospacing="0" w:after="0" w:afterAutospacing="0"/>
+              <w:jc w:val="both"/>
+              <w:textAlignment w:val="baseline"/>
+              <w:rPr>
+                <w:rFonts w:ascii="Segoe UI" w:hAnsi="Segoe UI" w:cs="Segoe UI"/>
+                <w:sz w:val="18"/>
+                <w:szCs w:val="18"/>
+              </w:rPr>
+            </w:pPr>
+          </w:p>
+          <w:p>
+            <w:pPr>
+              <w:pStyle w:val="paragraph"/>
+              <w:spacing w:before="0" w:beforeAutospacing="0" w:after="0" w:afterAutospacing="0"/>
+              <w:jc w:val="both"/>
+              <w:textAlignment w:val="baseline"/>
+              <w:rPr>
+                <w:rFonts w:ascii="Segoe UI" w:hAnsi="Segoe UI" w:cs="Segoe UI"/>
+                <w:sz w:val="18"/>
+                <w:szCs w:val="18"/>
+              </w:rPr>
+            </w:pPr>
+            <w:r>
+              <w:rPr>
+                <w:rFonts w:ascii="Segoe UI" w:hAnsi="Segoe UI" w:cs="Segoe UI"/>
+                <w:sz w:val="18"/>
+                <w:szCs w:val="18"/>
+              </w:rPr>
+              <w:t>El principal aporte del proyecto consiste en proponer una alternativa digital que facilite la conexión entre clientes y trabajadores independientes, contribuyendo a la digitalización de servicios y aplicando conocimientos técnicos adquiridos durante la carrera.</w:t>
+            </w:r>
+          </w:p>
+          <w:p>
+            <w:pPr>
+              <w:pStyle w:val="paragraph"/>
+              <w:spacing w:before="0" w:beforeAutospacing="0" w:after="0" w:afterAutospacing="0"/>
+              <w:jc w:val="both"/>
+              <w:textAlignment w:val="baseline"/>
+              <w:rPr>
+                <w:rStyle w:val="normaltextrun"/>
+                <w:rFonts w:ascii="Segoe UI" w:hAnsi="Segoe UI" w:cs="Segoe UI"/>
+                <w:color w:val="0070C0"/>
+                <w:sz w:val="18"/>
+                <w:szCs w:val="18"/>
+              </w:rPr>
+            </w:pPr>
+          </w:p>
+          <w:p>
+            <w:pPr>
+              <w:pStyle w:val="paragraph"/>
+              <w:spacing w:before="0" w:beforeAutospacing="0" w:after="0" w:afterAutospacing="0"/>
+              <w:ind w:left="301"/>
+              <w:jc w:val="both"/>
+              <w:textAlignment w:val="baseline"/>
+              <w:rPr>
+                <w:rStyle w:val="normaltextrun"/>
+                <w:rFonts w:ascii="Segoe UI" w:hAnsi="Segoe UI" w:cs="Segoe UI"/>
+                <w:color w:val="0070C0"/>
+                <w:sz w:val="18"/>
+                <w:szCs w:val="18"/>
+              </w:rPr>
+            </w:pPr>
+          </w:p>
+          <w:p>
+            <w:pPr>
+              <w:pStyle w:val="paragraph"/>
               <w:numPr>
                 <w:ilvl w:val="0"/>
                 <w:numId w:val="6"/>
@@ -1434,6 +1639,7 @@
                 <w:color w:val="1F3864" w:themeColor="accent1" w:themeShade="80"/>
                 <w:sz w:val="18"/>
               </w:rPr>
+              <w:lastRenderedPageBreak/>
               <w:t xml:space="preserve">2. Objetivos </w:t>
             </w:r>
           </w:p>
@@ -1443,6 +1649,449 @@
             <w:tcW w:w="6780" w:type="dxa"/>
             <w:vAlign w:val="center"/>
           </w:tcPr>
+          <w:p>
+            <w:pPr>
+              <w:pStyle w:val="Prrafodelista"/>
+              <w:spacing w:after="0" w:line="240" w:lineRule="auto"/>
+              <w:ind w:left="314"/>
+              <w:jc w:val="both"/>
+              <w:rPr>
+                <w:rFonts w:ascii="Calibri" w:hAnsi="Calibri" w:cs="Arial"/>
+                <w:i/>
+                <w:color w:val="0070C0"/>
+                <w:sz w:val="18"/>
+                <w:szCs w:val="20"/>
+                <w:lang w:eastAsia="es-CL"/>
+              </w:rPr>
+            </w:pPr>
+          </w:p>
+          <w:p>
+            <w:pPr>
+              <w:pStyle w:val="Prrafodelista"/>
+              <w:spacing w:after="0" w:line="240" w:lineRule="auto"/>
+              <w:ind w:left="314"/>
+              <w:jc w:val="both"/>
+              <w:rPr>
+                <w:rFonts w:ascii="Calibri" w:hAnsi="Calibri" w:cs="Arial"/>
+                <w:i/>
+                <w:sz w:val="18"/>
+                <w:szCs w:val="20"/>
+                <w:lang w:eastAsia="es-CL"/>
+              </w:rPr>
+            </w:pPr>
+            <w:r>
+              <w:rPr>
+                <w:rFonts w:ascii="Calibri" w:hAnsi="Calibri" w:cs="Arial"/>
+                <w:i/>
+                <w:sz w:val="18"/>
+                <w:szCs w:val="20"/>
+                <w:lang w:eastAsia="es-CL"/>
+              </w:rPr>
+              <w:t xml:space="preserve">Objetivo general: </w:t>
+            </w:r>
+            <w:r>
+              <w:rPr>
+                <w:rFonts w:ascii="Calibri" w:hAnsi="Calibri" w:cs="Arial"/>
+                <w:i/>
+                <w:sz w:val="18"/>
+                <w:szCs w:val="20"/>
+                <w:lang w:eastAsia="es-CL"/>
+              </w:rPr>
+              <w:t>Diseñar y desarrollar una aplicación móvil que conecte clientes y trabajadores independientes mediante un Marketplace geolocalizado de servicios, facilitando la búsqueda, contratación, coordinación y pago de servicios de forma segura, organizada y accesible</w:t>
+            </w:r>
+            <w:r>
+              <w:rPr>
+                <w:rFonts w:ascii="Calibri" w:hAnsi="Calibri" w:cs="Arial"/>
+                <w:i/>
+                <w:sz w:val="18"/>
+                <w:szCs w:val="20"/>
+                <w:lang w:eastAsia="es-CL"/>
+              </w:rPr>
+              <w:t>.</w:t>
+            </w:r>
+          </w:p>
+          <w:p>
+            <w:pPr>
+              <w:pStyle w:val="Prrafodelista"/>
+              <w:spacing w:after="0" w:line="240" w:lineRule="auto"/>
+              <w:ind w:left="314"/>
+              <w:jc w:val="both"/>
+              <w:rPr>
+                <w:rFonts w:ascii="Calibri" w:hAnsi="Calibri" w:cs="Arial"/>
+                <w:i/>
+                <w:sz w:val="18"/>
+                <w:szCs w:val="20"/>
+                <w:lang w:eastAsia="es-CL"/>
+              </w:rPr>
+            </w:pPr>
+          </w:p>
+          <w:p>
+            <w:pPr>
+              <w:pStyle w:val="Prrafodelista"/>
+              <w:spacing w:after="0" w:line="240" w:lineRule="auto"/>
+              <w:ind w:left="314"/>
+              <w:jc w:val="both"/>
+              <w:rPr>
+                <w:rFonts w:ascii="Calibri" w:hAnsi="Calibri" w:cs="Arial"/>
+                <w:i/>
+                <w:sz w:val="18"/>
+                <w:szCs w:val="20"/>
+                <w:lang w:eastAsia="es-CL"/>
+              </w:rPr>
+            </w:pPr>
+            <w:r>
+              <w:rPr>
+                <w:rFonts w:ascii="Calibri" w:hAnsi="Calibri" w:cs="Arial"/>
+                <w:i/>
+                <w:sz w:val="18"/>
+                <w:szCs w:val="20"/>
+                <w:lang w:eastAsia="es-CL"/>
+              </w:rPr>
+              <w:t>· Permitir</w:t>
+            </w:r>
+            <w:r>
+              <w:rPr>
+                <w:rFonts w:ascii="Calibri" w:hAnsi="Calibri" w:cs="Arial"/>
+                <w:i/>
+                <w:sz w:val="18"/>
+                <w:szCs w:val="20"/>
+                <w:lang w:eastAsia="es-CL"/>
+              </w:rPr>
+              <w:t xml:space="preserve"> el registro de usuarios y la selección de un perfil de cliente o trabajador.</w:t>
+            </w:r>
+          </w:p>
+          <w:p>
+            <w:pPr>
+              <w:pStyle w:val="Prrafodelista"/>
+              <w:spacing w:after="0" w:line="240" w:lineRule="auto"/>
+              <w:ind w:left="314"/>
+              <w:jc w:val="both"/>
+              <w:rPr>
+                <w:rFonts w:ascii="Calibri" w:hAnsi="Calibri" w:cs="Arial"/>
+                <w:i/>
+                <w:sz w:val="18"/>
+                <w:szCs w:val="20"/>
+                <w:lang w:eastAsia="es-CL"/>
+              </w:rPr>
+            </w:pPr>
+            <w:r>
+              <w:rPr>
+                <w:rFonts w:ascii="Calibri" w:hAnsi="Calibri" w:cs="Arial"/>
+                <w:i/>
+                <w:sz w:val="18"/>
+                <w:szCs w:val="20"/>
+                <w:lang w:eastAsia="es-CL"/>
+              </w:rPr>
+              <w:t>· Permitir a los trabajadores crear, publicar, modificar y administrar sus servicios.</w:t>
+            </w:r>
+          </w:p>
+          <w:p>
+            <w:pPr>
+              <w:pStyle w:val="Prrafodelista"/>
+              <w:spacing w:after="0" w:line="240" w:lineRule="auto"/>
+              <w:ind w:left="314"/>
+              <w:jc w:val="both"/>
+              <w:rPr>
+                <w:rFonts w:ascii="Calibri" w:hAnsi="Calibri" w:cs="Arial"/>
+                <w:i/>
+                <w:sz w:val="18"/>
+                <w:szCs w:val="20"/>
+                <w:lang w:eastAsia="es-CL"/>
+              </w:rPr>
+            </w:pPr>
+            <w:r>
+              <w:rPr>
+                <w:rFonts w:ascii="Calibri" w:hAnsi="Calibri" w:cs="Arial"/>
+                <w:i/>
+                <w:sz w:val="18"/>
+                <w:szCs w:val="20"/>
+                <w:lang w:eastAsia="es-CL"/>
+              </w:rPr>
+              <w:t>·Permitir a los clientes buscar servicios mediante categorías, palabras clave y ubicación.</w:t>
+            </w:r>
+          </w:p>
+          <w:p>
+            <w:pPr>
+              <w:pStyle w:val="Prrafodelista"/>
+              <w:spacing w:after="0" w:line="240" w:lineRule="auto"/>
+              <w:ind w:left="314"/>
+              <w:jc w:val="both"/>
+              <w:rPr>
+                <w:rFonts w:ascii="Calibri" w:hAnsi="Calibri" w:cs="Arial"/>
+                <w:i/>
+                <w:sz w:val="18"/>
+                <w:szCs w:val="20"/>
+                <w:lang w:eastAsia="es-CL"/>
+              </w:rPr>
+            </w:pPr>
+            <w:r>
+              <w:rPr>
+                <w:rFonts w:ascii="Calibri" w:hAnsi="Calibri" w:cs="Arial"/>
+                <w:i/>
+                <w:sz w:val="18"/>
+                <w:szCs w:val="20"/>
+                <w:lang w:eastAsia="es-CL"/>
+              </w:rPr>
+              <w:t>· Mostrar servicios cercanos mediante un mapa utilizando ubicaciones registradas, sin seguimiento en tiempo real.</w:t>
+            </w:r>
+          </w:p>
+          <w:p>
+            <w:pPr>
+              <w:pStyle w:val="Prrafodelista"/>
+              <w:spacing w:after="0" w:line="240" w:lineRule="auto"/>
+              <w:ind w:left="314"/>
+              <w:jc w:val="both"/>
+              <w:rPr>
+                <w:rFonts w:ascii="Calibri" w:hAnsi="Calibri" w:cs="Arial"/>
+                <w:i/>
+                <w:sz w:val="18"/>
+                <w:szCs w:val="20"/>
+                <w:lang w:eastAsia="es-CL"/>
+              </w:rPr>
+            </w:pPr>
+            <w:r>
+              <w:rPr>
+                <w:rFonts w:ascii="Calibri" w:hAnsi="Calibri" w:cs="Arial"/>
+                <w:i/>
+                <w:sz w:val="18"/>
+                <w:szCs w:val="20"/>
+                <w:lang w:eastAsia="es-CL"/>
+              </w:rPr>
+              <w:t>·Permitir consultar descripción, precio, disponibilidad y datos relevantes antes de solicitar.</w:t>
+            </w:r>
+          </w:p>
+          <w:p>
+            <w:pPr>
+              <w:pStyle w:val="Prrafodelista"/>
+              <w:spacing w:after="0" w:line="240" w:lineRule="auto"/>
+              <w:ind w:left="314"/>
+              <w:jc w:val="both"/>
+              <w:rPr>
+                <w:rFonts w:ascii="Calibri" w:hAnsi="Calibri" w:cs="Arial"/>
+                <w:i/>
+                <w:sz w:val="18"/>
+                <w:szCs w:val="20"/>
+                <w:lang w:eastAsia="es-CL"/>
+              </w:rPr>
+            </w:pPr>
+            <w:r>
+              <w:rPr>
+                <w:rFonts w:ascii="Calibri" w:hAnsi="Calibri" w:cs="Arial"/>
+                <w:i/>
+                <w:sz w:val="18"/>
+                <w:szCs w:val="20"/>
+                <w:lang w:eastAsia="es-CL"/>
+              </w:rPr>
+              <w:t>· Permitir seleccionar fecha, horario y ubicación cuando corresponda.</w:t>
+            </w:r>
+          </w:p>
+          <w:p>
+            <w:pPr>
+              <w:pStyle w:val="Prrafodelista"/>
+              <w:spacing w:after="0" w:line="240" w:lineRule="auto"/>
+              <w:ind w:left="314"/>
+              <w:jc w:val="both"/>
+              <w:rPr>
+                <w:rFonts w:ascii="Calibri" w:hAnsi="Calibri" w:cs="Arial"/>
+                <w:i/>
+                <w:sz w:val="18"/>
+                <w:szCs w:val="20"/>
+                <w:lang w:eastAsia="es-CL"/>
+              </w:rPr>
+            </w:pPr>
+            <w:r>
+              <w:rPr>
+                <w:rFonts w:ascii="Calibri" w:hAnsi="Calibri" w:cs="Arial"/>
+                <w:i/>
+                <w:sz w:val="18"/>
+                <w:szCs w:val="20"/>
+                <w:lang w:eastAsia="es-CL"/>
+              </w:rPr>
+              <w:t>·Implementar solicitudes que el trabajador pueda aceptar o rechazar.</w:t>
+            </w:r>
+          </w:p>
+          <w:p>
+            <w:pPr>
+              <w:pStyle w:val="Prrafodelista"/>
+              <w:spacing w:after="0" w:line="240" w:lineRule="auto"/>
+              <w:ind w:left="314"/>
+              <w:jc w:val="both"/>
+              <w:rPr>
+                <w:rFonts w:ascii="Calibri" w:hAnsi="Calibri" w:cs="Arial"/>
+                <w:i/>
+                <w:sz w:val="18"/>
+                <w:szCs w:val="20"/>
+                <w:lang w:eastAsia="es-CL"/>
+              </w:rPr>
+            </w:pPr>
+            <w:r>
+              <w:rPr>
+                <w:rFonts w:ascii="Calibri" w:hAnsi="Calibri" w:cs="Arial"/>
+                <w:i/>
+                <w:sz w:val="18"/>
+                <w:szCs w:val="20"/>
+                <w:lang w:eastAsia="es-CL"/>
+              </w:rPr>
+              <w:t>·Incorporar chat entre cliente y trabajador.</w:t>
+            </w:r>
+          </w:p>
+          <w:p>
+            <w:pPr>
+              <w:pStyle w:val="Prrafodelista"/>
+              <w:spacing w:after="0" w:line="240" w:lineRule="auto"/>
+              <w:ind w:left="314"/>
+              <w:jc w:val="both"/>
+              <w:rPr>
+                <w:rFonts w:ascii="Calibri" w:hAnsi="Calibri" w:cs="Arial"/>
+                <w:i/>
+                <w:sz w:val="18"/>
+                <w:szCs w:val="20"/>
+                <w:lang w:eastAsia="es-CL"/>
+              </w:rPr>
+            </w:pPr>
+            <w:r>
+              <w:rPr>
+                <w:rFonts w:ascii="Calibri" w:hAnsi="Calibri" w:cs="Arial"/>
+                <w:i/>
+                <w:sz w:val="18"/>
+                <w:szCs w:val="20"/>
+                <w:lang w:eastAsia="es-CL"/>
+              </w:rPr>
+              <w:t>· Permitir pagos dentro de la plataforma y gestionar una comisión por transacción.</w:t>
+            </w:r>
+          </w:p>
+          <w:p>
+            <w:pPr>
+              <w:pStyle w:val="Prrafodelista"/>
+              <w:spacing w:after="0" w:line="240" w:lineRule="auto"/>
+              <w:ind w:left="314"/>
+              <w:jc w:val="both"/>
+              <w:rPr>
+                <w:rFonts w:ascii="Calibri" w:hAnsi="Calibri" w:cs="Arial"/>
+                <w:i/>
+                <w:sz w:val="18"/>
+                <w:szCs w:val="20"/>
+                <w:lang w:eastAsia="es-CL"/>
+              </w:rPr>
+            </w:pPr>
+            <w:r>
+              <w:rPr>
+                <w:rFonts w:ascii="Calibri" w:hAnsi="Calibri" w:cs="Arial"/>
+                <w:i/>
+                <w:sz w:val="18"/>
+                <w:szCs w:val="20"/>
+                <w:lang w:eastAsia="es-CL"/>
+              </w:rPr>
+              <w:t>· Implementar calificaciones y reseñas posteriores al servicio.</w:t>
+            </w:r>
+          </w:p>
+          <w:p>
+            <w:pPr>
+              <w:pStyle w:val="Prrafodelista"/>
+              <w:spacing w:after="0" w:line="240" w:lineRule="auto"/>
+              <w:ind w:left="314"/>
+              <w:jc w:val="both"/>
+              <w:rPr>
+                <w:rFonts w:ascii="Calibri" w:hAnsi="Calibri" w:cs="Arial"/>
+                <w:i/>
+                <w:sz w:val="18"/>
+                <w:szCs w:val="20"/>
+                <w:lang w:eastAsia="es-CL"/>
+              </w:rPr>
+            </w:pPr>
+            <w:r>
+              <w:rPr>
+                <w:rFonts w:ascii="Calibri" w:hAnsi="Calibri" w:cs="Arial"/>
+                <w:i/>
+                <w:sz w:val="18"/>
+                <w:szCs w:val="20"/>
+                <w:lang w:eastAsia="es-CL"/>
+              </w:rPr>
+              <w:t>· Implementar verificación de identidad y documentación del trabajador.</w:t>
+            </w:r>
+          </w:p>
+          <w:p>
+            <w:pPr>
+              <w:pStyle w:val="Prrafodelista"/>
+              <w:spacing w:after="0" w:line="240" w:lineRule="auto"/>
+              <w:ind w:left="314"/>
+              <w:jc w:val="both"/>
+              <w:rPr>
+                <w:rFonts w:ascii="Calibri" w:hAnsi="Calibri" w:cs="Arial"/>
+                <w:i/>
+                <w:sz w:val="18"/>
+                <w:szCs w:val="20"/>
+                <w:lang w:eastAsia="es-CL"/>
+              </w:rPr>
+            </w:pPr>
+            <w:proofErr w:type="gramStart"/>
+            <w:r>
+              <w:rPr>
+                <w:rFonts w:ascii="Calibri" w:hAnsi="Calibri" w:cs="Arial"/>
+                <w:i/>
+                <w:sz w:val="18"/>
+                <w:szCs w:val="20"/>
+                <w:lang w:eastAsia="es-CL"/>
+              </w:rPr>
+              <w:t>·  Considerar</w:t>
+            </w:r>
+            <w:proofErr w:type="gramEnd"/>
+            <w:r>
+              <w:rPr>
+                <w:rFonts w:ascii="Calibri" w:hAnsi="Calibri" w:cs="Arial"/>
+                <w:i/>
+                <w:sz w:val="18"/>
+                <w:szCs w:val="20"/>
+                <w:lang w:eastAsia="es-CL"/>
+              </w:rPr>
+              <w:t xml:space="preserve"> validación de certificaciones para servicios que la requieran.</w:t>
+            </w:r>
+          </w:p>
+          <w:p>
+            <w:pPr>
+              <w:pStyle w:val="Prrafodelista"/>
+              <w:spacing w:after="0" w:line="240" w:lineRule="auto"/>
+              <w:ind w:left="314"/>
+              <w:jc w:val="both"/>
+              <w:rPr>
+                <w:rFonts w:ascii="Calibri" w:hAnsi="Calibri" w:cs="Arial"/>
+                <w:i/>
+                <w:sz w:val="18"/>
+                <w:szCs w:val="20"/>
+                <w:lang w:eastAsia="es-CL"/>
+              </w:rPr>
+            </w:pPr>
+          </w:p>
+          <w:p>
+            <w:pPr>
+              <w:pStyle w:val="Prrafodelista"/>
+              <w:spacing w:after="0" w:line="240" w:lineRule="auto"/>
+              <w:ind w:left="314"/>
+              <w:jc w:val="both"/>
+              <w:rPr>
+                <w:rFonts w:ascii="Calibri" w:hAnsi="Calibri" w:cs="Arial"/>
+                <w:i/>
+                <w:sz w:val="18"/>
+                <w:szCs w:val="20"/>
+                <w:lang w:eastAsia="es-CL"/>
+              </w:rPr>
+            </w:pPr>
+          </w:p>
+          <w:p>
+            <w:pPr>
+              <w:pStyle w:val="Prrafodelista"/>
+              <w:spacing w:after="0" w:line="240" w:lineRule="auto"/>
+              <w:ind w:left="314"/>
+              <w:jc w:val="both"/>
+              <w:rPr>
+                <w:rFonts w:ascii="Calibri" w:hAnsi="Calibri" w:cs="Arial"/>
+                <w:i/>
+                <w:sz w:val="18"/>
+                <w:szCs w:val="20"/>
+                <w:lang w:eastAsia="es-CL"/>
+              </w:rPr>
+            </w:pPr>
+          </w:p>
           <w:p>
             <w:pPr>
               <w:pStyle w:val="Prrafodelista"/>
@@ -1456,17 +2105,15 @@
               <w:rPr>
                 <w:rFonts w:ascii="Calibri" w:hAnsi="Calibri" w:cs="Arial"/>
                 <w:i/>
-                <w:color w:val="0070C0"/>
-                <w:sz w:val="18"/>
-                <w:szCs w:val="20"/>
-                <w:lang w:eastAsia="es-CL"/>
-              </w:rPr>
-            </w:pPr>
-            <w:r>
-              <w:rPr>
-                <w:rFonts w:ascii="Calibri" w:hAnsi="Calibri" w:cs="Arial"/>
-                <w:i/>
-                <w:color w:val="0070C0"/>
+                <w:sz w:val="18"/>
+                <w:szCs w:val="20"/>
+                <w:lang w:eastAsia="es-CL"/>
+              </w:rPr>
+            </w:pPr>
+            <w:r>
+              <w:rPr>
+                <w:rFonts w:ascii="Calibri" w:hAnsi="Calibri" w:cs="Arial"/>
+                <w:i/>
                 <w:sz w:val="18"/>
                 <w:szCs w:val="20"/>
                 <w:lang w:eastAsia="es-CL"/>
@@ -1530,6 +2177,379 @@
             <w:tcW w:w="6780" w:type="dxa"/>
             <w:vAlign w:val="center"/>
           </w:tcPr>
+          <w:p>
+            <w:pPr>
+              <w:spacing w:after="0" w:line="240" w:lineRule="auto"/>
+              <w:jc w:val="both"/>
+              <w:rPr>
+                <w:rFonts w:ascii="Calibri" w:hAnsi="Calibri" w:cs="Arial"/>
+                <w:i/>
+                <w:sz w:val="18"/>
+                <w:szCs w:val="20"/>
+                <w:lang w:eastAsia="es-CL"/>
+              </w:rPr>
+            </w:pPr>
+            <w:r>
+              <w:rPr>
+                <w:rFonts w:ascii="Calibri" w:hAnsi="Calibri" w:cs="Arial"/>
+                <w:i/>
+                <w:sz w:val="18"/>
+                <w:szCs w:val="20"/>
+                <w:lang w:eastAsia="es-CL"/>
+              </w:rPr>
+              <w:t xml:space="preserve">Para el desarrollo del proyecto </w:t>
+            </w:r>
+            <w:proofErr w:type="spellStart"/>
+            <w:r>
+              <w:rPr>
+                <w:rFonts w:ascii="Calibri" w:hAnsi="Calibri" w:cs="Arial"/>
+                <w:i/>
+                <w:sz w:val="18"/>
+                <w:szCs w:val="20"/>
+                <w:lang w:eastAsia="es-CL"/>
+              </w:rPr>
+              <w:t>ServiMatch</w:t>
+            </w:r>
+            <w:proofErr w:type="spellEnd"/>
+            <w:r>
+              <w:rPr>
+                <w:rFonts w:ascii="Calibri" w:hAnsi="Calibri" w:cs="Arial"/>
+                <w:i/>
+                <w:sz w:val="18"/>
+                <w:szCs w:val="20"/>
+                <w:lang w:eastAsia="es-CL"/>
+              </w:rPr>
+              <w:t xml:space="preserve"> se utilizó la metodología ágil Scrum, permitiendo organizar el trabajo en iteraciones denominadas </w:t>
+            </w:r>
+            <w:proofErr w:type="spellStart"/>
+            <w:r>
+              <w:rPr>
+                <w:rFonts w:ascii="Calibri" w:hAnsi="Calibri" w:cs="Arial"/>
+                <w:i/>
+                <w:sz w:val="18"/>
+                <w:szCs w:val="20"/>
+                <w:lang w:eastAsia="es-CL"/>
+              </w:rPr>
+              <w:t>sprints</w:t>
+            </w:r>
+            <w:proofErr w:type="spellEnd"/>
+            <w:r>
+              <w:rPr>
+                <w:rFonts w:ascii="Calibri" w:hAnsi="Calibri" w:cs="Arial"/>
+                <w:i/>
+                <w:sz w:val="18"/>
+                <w:szCs w:val="20"/>
+                <w:lang w:eastAsia="es-CL"/>
+              </w:rPr>
+              <w:t>. Esta metodología facilitó la distribución de responsabilidades, el seguimiento de actividades y la implementación progresiva de las funcionalidades de la aplicación.</w:t>
+            </w:r>
+          </w:p>
+          <w:p>
+            <w:pPr>
+              <w:spacing w:after="0" w:line="240" w:lineRule="auto"/>
+              <w:jc w:val="both"/>
+              <w:rPr>
+                <w:rFonts w:ascii="Calibri" w:hAnsi="Calibri" w:cs="Arial"/>
+                <w:i/>
+                <w:sz w:val="18"/>
+                <w:szCs w:val="20"/>
+                <w:lang w:eastAsia="es-CL"/>
+              </w:rPr>
+            </w:pPr>
+          </w:p>
+          <w:p>
+            <w:pPr>
+              <w:spacing w:after="0" w:line="240" w:lineRule="auto"/>
+              <w:jc w:val="both"/>
+              <w:rPr>
+                <w:rFonts w:ascii="Calibri" w:hAnsi="Calibri" w:cs="Arial"/>
+                <w:i/>
+                <w:sz w:val="18"/>
+                <w:szCs w:val="20"/>
+                <w:lang w:eastAsia="es-CL"/>
+              </w:rPr>
+            </w:pPr>
+            <w:r>
+              <w:rPr>
+                <w:rFonts w:ascii="Calibri" w:hAnsi="Calibri" w:cs="Arial"/>
+                <w:i/>
+                <w:sz w:val="18"/>
+                <w:szCs w:val="20"/>
+                <w:lang w:eastAsia="es-CL"/>
+              </w:rPr>
+              <w:t xml:space="preserve">Inicialmente, el equipo realizó el análisis de la problemática, la identificación de requerimientos y la elaboración de historias de usuario, épicas y </w:t>
+            </w:r>
+            <w:proofErr w:type="spellStart"/>
+            <w:r>
+              <w:rPr>
+                <w:rFonts w:ascii="Calibri" w:hAnsi="Calibri" w:cs="Arial"/>
+                <w:i/>
+                <w:sz w:val="18"/>
+                <w:szCs w:val="20"/>
+                <w:lang w:eastAsia="es-CL"/>
+              </w:rPr>
+              <w:t>Product</w:t>
+            </w:r>
+            <w:proofErr w:type="spellEnd"/>
+            <w:r>
+              <w:rPr>
+                <w:rFonts w:ascii="Calibri" w:hAnsi="Calibri" w:cs="Arial"/>
+                <w:i/>
+                <w:sz w:val="18"/>
+                <w:szCs w:val="20"/>
+                <w:lang w:eastAsia="es-CL"/>
+              </w:rPr>
+              <w:t xml:space="preserve"> Backlog. Posteriormente, se desarrollaron los diagramas UML, el modelo de datos y la arquitectura general de la solución.</w:t>
+            </w:r>
+          </w:p>
+          <w:p>
+            <w:pPr>
+              <w:spacing w:after="0" w:line="240" w:lineRule="auto"/>
+              <w:jc w:val="both"/>
+              <w:rPr>
+                <w:rFonts w:ascii="Calibri" w:hAnsi="Calibri" w:cs="Arial"/>
+                <w:i/>
+                <w:sz w:val="18"/>
+                <w:szCs w:val="20"/>
+                <w:lang w:eastAsia="es-CL"/>
+              </w:rPr>
+            </w:pPr>
+          </w:p>
+          <w:p>
+            <w:pPr>
+              <w:spacing w:after="0" w:line="240" w:lineRule="auto"/>
+              <w:jc w:val="both"/>
+              <w:rPr>
+                <w:rFonts w:ascii="Calibri" w:hAnsi="Calibri" w:cs="Arial"/>
+                <w:i/>
+                <w:sz w:val="18"/>
+                <w:szCs w:val="20"/>
+                <w:lang w:eastAsia="es-CL"/>
+              </w:rPr>
+            </w:pPr>
+            <w:r>
+              <w:rPr>
+                <w:rFonts w:ascii="Calibri" w:hAnsi="Calibri" w:cs="Arial"/>
+                <w:i/>
+                <w:sz w:val="18"/>
+                <w:szCs w:val="20"/>
+                <w:lang w:eastAsia="es-CL"/>
+              </w:rPr>
+              <w:lastRenderedPageBreak/>
+              <w:t xml:space="preserve">Durante las siguientes etapas se preparó el entorno de desarrollo utilizando </w:t>
+            </w:r>
+            <w:proofErr w:type="spellStart"/>
+            <w:r>
+              <w:rPr>
+                <w:rFonts w:ascii="Calibri" w:hAnsi="Calibri" w:cs="Arial"/>
+                <w:i/>
+                <w:sz w:val="18"/>
+                <w:szCs w:val="20"/>
+                <w:lang w:eastAsia="es-CL"/>
+              </w:rPr>
+              <w:t>React</w:t>
+            </w:r>
+            <w:proofErr w:type="spellEnd"/>
+            <w:r>
+              <w:rPr>
+                <w:rFonts w:ascii="Calibri" w:hAnsi="Calibri" w:cs="Arial"/>
+                <w:i/>
+                <w:sz w:val="18"/>
+                <w:szCs w:val="20"/>
+                <w:lang w:eastAsia="es-CL"/>
+              </w:rPr>
+              <w:t xml:space="preserve"> Native con Expo para la aplicación móvil, </w:t>
+            </w:r>
+            <w:proofErr w:type="spellStart"/>
+            <w:r>
+              <w:rPr>
+                <w:rFonts w:ascii="Calibri" w:hAnsi="Calibri" w:cs="Arial"/>
+                <w:i/>
+                <w:sz w:val="18"/>
+                <w:szCs w:val="20"/>
+                <w:lang w:eastAsia="es-CL"/>
+              </w:rPr>
+              <w:t>FastAPI</w:t>
+            </w:r>
+            <w:proofErr w:type="spellEnd"/>
+            <w:r>
+              <w:rPr>
+                <w:rFonts w:ascii="Calibri" w:hAnsi="Calibri" w:cs="Arial"/>
+                <w:i/>
+                <w:sz w:val="18"/>
+                <w:szCs w:val="20"/>
+                <w:lang w:eastAsia="es-CL"/>
+              </w:rPr>
+              <w:t xml:space="preserve"> para el </w:t>
+            </w:r>
+            <w:proofErr w:type="spellStart"/>
+            <w:r>
+              <w:rPr>
+                <w:rFonts w:ascii="Calibri" w:hAnsi="Calibri" w:cs="Arial"/>
+                <w:i/>
+                <w:sz w:val="18"/>
+                <w:szCs w:val="20"/>
+                <w:lang w:eastAsia="es-CL"/>
+              </w:rPr>
+              <w:t>backend</w:t>
+            </w:r>
+            <w:proofErr w:type="spellEnd"/>
+            <w:r>
+              <w:rPr>
+                <w:rFonts w:ascii="Calibri" w:hAnsi="Calibri" w:cs="Arial"/>
+                <w:i/>
+                <w:sz w:val="18"/>
+                <w:szCs w:val="20"/>
+                <w:lang w:eastAsia="es-CL"/>
+              </w:rPr>
+              <w:t xml:space="preserve"> y PostgreSQL mediante </w:t>
+            </w:r>
+            <w:proofErr w:type="spellStart"/>
+            <w:r>
+              <w:rPr>
+                <w:rFonts w:ascii="Calibri" w:hAnsi="Calibri" w:cs="Arial"/>
+                <w:i/>
+                <w:sz w:val="18"/>
+                <w:szCs w:val="20"/>
+                <w:lang w:eastAsia="es-CL"/>
+              </w:rPr>
+              <w:t>Supabase</w:t>
+            </w:r>
+            <w:proofErr w:type="spellEnd"/>
+            <w:r>
+              <w:rPr>
+                <w:rFonts w:ascii="Calibri" w:hAnsi="Calibri" w:cs="Arial"/>
+                <w:i/>
+                <w:sz w:val="18"/>
+                <w:szCs w:val="20"/>
+                <w:lang w:eastAsia="es-CL"/>
+              </w:rPr>
+              <w:t xml:space="preserve"> para la gestión de datos.</w:t>
+            </w:r>
+          </w:p>
+          <w:p>
+            <w:pPr>
+              <w:spacing w:after="0" w:line="240" w:lineRule="auto"/>
+              <w:jc w:val="both"/>
+              <w:rPr>
+                <w:rFonts w:ascii="Calibri" w:hAnsi="Calibri" w:cs="Arial"/>
+                <w:i/>
+                <w:sz w:val="18"/>
+                <w:szCs w:val="20"/>
+                <w:lang w:eastAsia="es-CL"/>
+              </w:rPr>
+            </w:pPr>
+          </w:p>
+          <w:p>
+            <w:pPr>
+              <w:spacing w:after="0" w:line="240" w:lineRule="auto"/>
+              <w:jc w:val="both"/>
+              <w:rPr>
+                <w:rFonts w:ascii="Calibri" w:hAnsi="Calibri" w:cs="Arial"/>
+                <w:i/>
+                <w:sz w:val="18"/>
+                <w:szCs w:val="20"/>
+                <w:lang w:eastAsia="es-CL"/>
+              </w:rPr>
+            </w:pPr>
+            <w:r>
+              <w:rPr>
+                <w:rFonts w:ascii="Calibri" w:hAnsi="Calibri" w:cs="Arial"/>
+                <w:i/>
+                <w:sz w:val="18"/>
+                <w:szCs w:val="20"/>
+                <w:lang w:eastAsia="es-CL"/>
+              </w:rPr>
+              <w:t xml:space="preserve">El desarrollo se realizó de manera incremental, incorporando funcionalidades y efectuando pruebas para identificar errores y oportunidades de mejora. Se utilizaron herramientas como Jira para la gestión de actividades, GitHub para el control de versiones y Docker para facilitar la ejecución del </w:t>
+            </w:r>
+            <w:proofErr w:type="spellStart"/>
+            <w:r>
+              <w:rPr>
+                <w:rFonts w:ascii="Calibri" w:hAnsi="Calibri" w:cs="Arial"/>
+                <w:i/>
+                <w:sz w:val="18"/>
+                <w:szCs w:val="20"/>
+                <w:lang w:eastAsia="es-CL"/>
+              </w:rPr>
+              <w:t>backend</w:t>
+            </w:r>
+            <w:proofErr w:type="spellEnd"/>
+            <w:r>
+              <w:rPr>
+                <w:rFonts w:ascii="Calibri" w:hAnsi="Calibri" w:cs="Arial"/>
+                <w:i/>
+                <w:sz w:val="18"/>
+                <w:szCs w:val="20"/>
+                <w:lang w:eastAsia="es-CL"/>
+              </w:rPr>
+              <w:t>.</w:t>
+            </w:r>
+          </w:p>
+          <w:p>
+            <w:pPr>
+              <w:spacing w:after="0" w:line="240" w:lineRule="auto"/>
+              <w:jc w:val="both"/>
+              <w:rPr>
+                <w:rFonts w:ascii="Calibri" w:hAnsi="Calibri" w:cs="Arial"/>
+                <w:i/>
+                <w:sz w:val="18"/>
+                <w:szCs w:val="20"/>
+                <w:lang w:eastAsia="es-CL"/>
+              </w:rPr>
+            </w:pPr>
+          </w:p>
+          <w:p>
+            <w:pPr>
+              <w:spacing w:after="0" w:line="240" w:lineRule="auto"/>
+              <w:jc w:val="both"/>
+              <w:rPr>
+                <w:rFonts w:ascii="Calibri" w:hAnsi="Calibri" w:cs="Arial"/>
+                <w:i/>
+                <w:sz w:val="18"/>
+                <w:szCs w:val="20"/>
+                <w:lang w:eastAsia="es-CL"/>
+              </w:rPr>
+            </w:pPr>
+            <w:r>
+              <w:rPr>
+                <w:rFonts w:ascii="Calibri" w:hAnsi="Calibri" w:cs="Arial"/>
+                <w:i/>
+                <w:sz w:val="18"/>
+                <w:szCs w:val="20"/>
+                <w:lang w:eastAsia="es-CL"/>
+              </w:rPr>
+              <w:t>La metodología Scrum fue pertinente para el proyecto porque permitió organizar el trabajo colaborativo, adaptar las prioridades frente a dificultades técnicas y mantener un seguimiento de los avances. Esto resultó especialmente útil durante la integración entre los componentes de la aplicación y los servicios externos de pago.</w:t>
+            </w:r>
+          </w:p>
+          <w:p>
+            <w:pPr>
+              <w:spacing w:after="0" w:line="240" w:lineRule="auto"/>
+              <w:jc w:val="both"/>
+              <w:rPr>
+                <w:rFonts w:ascii="Calibri" w:hAnsi="Calibri" w:cs="Arial"/>
+                <w:i/>
+                <w:sz w:val="18"/>
+                <w:szCs w:val="20"/>
+                <w:lang w:eastAsia="es-CL"/>
+              </w:rPr>
+            </w:pPr>
+          </w:p>
+          <w:p>
+            <w:pPr>
+              <w:pStyle w:val="Prrafodelista"/>
+              <w:spacing w:after="0" w:line="240" w:lineRule="auto"/>
+              <w:ind w:left="318"/>
+              <w:jc w:val="both"/>
+              <w:rPr>
+                <w:rFonts w:ascii="Calibri" w:hAnsi="Calibri" w:cs="Arial"/>
+                <w:i/>
+                <w:color w:val="0070C0"/>
+                <w:sz w:val="18"/>
+                <w:szCs w:val="20"/>
+                <w:lang w:eastAsia="es-CL"/>
+              </w:rPr>
+            </w:pPr>
+          </w:p>
           <w:p>
             <w:pPr>
               <w:pStyle w:val="Prrafodelista"/>
@@ -1668,6 +2688,327 @@
           </w:tcPr>
           <w:p>
             <w:pPr>
+              <w:spacing w:after="0" w:line="240" w:lineRule="auto"/>
+              <w:jc w:val="both"/>
+              <w:rPr>
+                <w:rFonts w:ascii="Calibri" w:hAnsi="Calibri" w:cs="Arial"/>
+                <w:i/>
+                <w:sz w:val="18"/>
+                <w:szCs w:val="20"/>
+                <w:lang w:eastAsia="es-CL"/>
+              </w:rPr>
+            </w:pPr>
+            <w:r>
+              <w:rPr>
+                <w:rFonts w:ascii="Calibri" w:hAnsi="Calibri" w:cs="Arial"/>
+                <w:i/>
+                <w:sz w:val="18"/>
+                <w:szCs w:val="20"/>
+                <w:lang w:eastAsia="es-CL"/>
+              </w:rPr>
+              <w:t xml:space="preserve">Durante el desarrollo de </w:t>
+            </w:r>
+            <w:proofErr w:type="spellStart"/>
+            <w:r>
+              <w:rPr>
+                <w:rFonts w:ascii="Calibri" w:hAnsi="Calibri" w:cs="Arial"/>
+                <w:i/>
+                <w:sz w:val="18"/>
+                <w:szCs w:val="20"/>
+                <w:lang w:eastAsia="es-CL"/>
+              </w:rPr>
+              <w:t>ServiMatch</w:t>
+            </w:r>
+            <w:proofErr w:type="spellEnd"/>
+            <w:r>
+              <w:rPr>
+                <w:rFonts w:ascii="Calibri" w:hAnsi="Calibri" w:cs="Arial"/>
+                <w:i/>
+                <w:sz w:val="18"/>
+                <w:szCs w:val="20"/>
+                <w:lang w:eastAsia="es-CL"/>
+              </w:rPr>
+              <w:t xml:space="preserve"> se presentaron diversas dificultades técnicas relacionadas con la integración entre la aplicación móvil, el </w:t>
+            </w:r>
+            <w:proofErr w:type="spellStart"/>
+            <w:r>
+              <w:rPr>
+                <w:rFonts w:ascii="Calibri" w:hAnsi="Calibri" w:cs="Arial"/>
+                <w:i/>
+                <w:sz w:val="18"/>
+                <w:szCs w:val="20"/>
+                <w:lang w:eastAsia="es-CL"/>
+              </w:rPr>
+              <w:t>backend</w:t>
+            </w:r>
+            <w:proofErr w:type="spellEnd"/>
+            <w:r>
+              <w:rPr>
+                <w:rFonts w:ascii="Calibri" w:hAnsi="Calibri" w:cs="Arial"/>
+                <w:i/>
+                <w:sz w:val="18"/>
+                <w:szCs w:val="20"/>
+                <w:lang w:eastAsia="es-CL"/>
+              </w:rPr>
+              <w:t xml:space="preserve"> y la base de datos.</w:t>
+            </w:r>
+          </w:p>
+          <w:p>
+            <w:pPr>
+              <w:spacing w:after="0" w:line="240" w:lineRule="auto"/>
+              <w:jc w:val="both"/>
+              <w:rPr>
+                <w:rFonts w:ascii="Calibri" w:hAnsi="Calibri" w:cs="Arial"/>
+                <w:i/>
+                <w:sz w:val="18"/>
+                <w:szCs w:val="20"/>
+                <w:lang w:eastAsia="es-CL"/>
+              </w:rPr>
+            </w:pPr>
+          </w:p>
+          <w:p>
+            <w:pPr>
+              <w:spacing w:after="0" w:line="240" w:lineRule="auto"/>
+              <w:jc w:val="both"/>
+              <w:rPr>
+                <w:rFonts w:ascii="Calibri" w:hAnsi="Calibri" w:cs="Arial"/>
+                <w:i/>
+                <w:sz w:val="18"/>
+                <w:szCs w:val="20"/>
+                <w:lang w:eastAsia="es-CL"/>
+              </w:rPr>
+            </w:pPr>
+            <w:r>
+              <w:rPr>
+                <w:rFonts w:ascii="Calibri" w:hAnsi="Calibri" w:cs="Arial"/>
+                <w:i/>
+                <w:sz w:val="18"/>
+                <w:szCs w:val="20"/>
+                <w:lang w:eastAsia="es-CL"/>
+              </w:rPr>
+              <w:t>Una de las principales dificultades fue la integración de Mercado Pago en su entorno de pruebas (Sandbox), debido a que inicialmente el flujo de pago no funcionaba correctamente dentro de la aplicación móvil.</w:t>
+            </w:r>
+          </w:p>
+          <w:p>
+            <w:pPr>
+              <w:spacing w:after="0" w:line="240" w:lineRule="auto"/>
+              <w:jc w:val="both"/>
+              <w:rPr>
+                <w:rFonts w:ascii="Calibri" w:hAnsi="Calibri" w:cs="Arial"/>
+                <w:i/>
+                <w:sz w:val="18"/>
+                <w:szCs w:val="20"/>
+                <w:lang w:eastAsia="es-CL"/>
+              </w:rPr>
+            </w:pPr>
+          </w:p>
+          <w:p>
+            <w:pPr>
+              <w:spacing w:after="0" w:line="240" w:lineRule="auto"/>
+              <w:jc w:val="both"/>
+              <w:rPr>
+                <w:rFonts w:ascii="Calibri" w:hAnsi="Calibri" w:cs="Arial"/>
+                <w:i/>
+                <w:sz w:val="18"/>
+                <w:szCs w:val="20"/>
+                <w:lang w:eastAsia="es-CL"/>
+              </w:rPr>
+            </w:pPr>
+            <w:r>
+              <w:rPr>
+                <w:rFonts w:ascii="Calibri" w:hAnsi="Calibri" w:cs="Arial"/>
+                <w:i/>
+                <w:sz w:val="18"/>
+                <w:szCs w:val="20"/>
+                <w:lang w:eastAsia="es-CL"/>
+              </w:rPr>
+              <w:t>Para solucionar este problema, se realizaron modificaciones en el código de la aplicación y en los componentes involucrados en la integración, revisando la comunicación con el servicio de Mercado Pago y el procesamiento de las respuestas de las transacciones.</w:t>
+            </w:r>
+          </w:p>
+          <w:p>
+            <w:pPr>
+              <w:spacing w:after="0" w:line="240" w:lineRule="auto"/>
+              <w:jc w:val="both"/>
+              <w:rPr>
+                <w:rFonts w:ascii="Calibri" w:hAnsi="Calibri" w:cs="Arial"/>
+                <w:i/>
+                <w:sz w:val="18"/>
+                <w:szCs w:val="20"/>
+                <w:lang w:eastAsia="es-CL"/>
+              </w:rPr>
+            </w:pPr>
+          </w:p>
+          <w:p>
+            <w:pPr>
+              <w:spacing w:after="0" w:line="240" w:lineRule="auto"/>
+              <w:jc w:val="both"/>
+              <w:rPr>
+                <w:rFonts w:ascii="Calibri" w:hAnsi="Calibri" w:cs="Arial"/>
+                <w:i/>
+                <w:sz w:val="18"/>
+                <w:szCs w:val="20"/>
+                <w:lang w:eastAsia="es-CL"/>
+              </w:rPr>
+            </w:pPr>
+            <w:r>
+              <w:rPr>
+                <w:rFonts w:ascii="Calibri" w:hAnsi="Calibri" w:cs="Arial"/>
+                <w:i/>
+                <w:sz w:val="18"/>
+                <w:szCs w:val="20"/>
+                <w:lang w:eastAsia="es-CL"/>
+              </w:rPr>
+              <w:t>Después de realizar estos ajustes y ejecutar las pruebas correspondientes, se logró que Mercado Pago funcionara correctamente dentro de la aplicación, permitiendo completar el flujo de pago mediante transacciones simuladas, sin utilizar dinero real.</w:t>
+            </w:r>
+          </w:p>
+          <w:p>
+            <w:pPr>
+              <w:spacing w:after="0" w:line="240" w:lineRule="auto"/>
+              <w:jc w:val="both"/>
+              <w:rPr>
+                <w:rFonts w:ascii="Calibri" w:hAnsi="Calibri" w:cs="Arial"/>
+                <w:i/>
+                <w:sz w:val="18"/>
+                <w:szCs w:val="20"/>
+                <w:lang w:eastAsia="es-CL"/>
+              </w:rPr>
+            </w:pPr>
+          </w:p>
+          <w:p>
+            <w:pPr>
+              <w:spacing w:after="0" w:line="240" w:lineRule="auto"/>
+              <w:jc w:val="both"/>
+              <w:rPr>
+                <w:rFonts w:ascii="Calibri" w:hAnsi="Calibri" w:cs="Arial"/>
+                <w:i/>
+                <w:sz w:val="18"/>
+                <w:szCs w:val="20"/>
+                <w:lang w:eastAsia="es-CL"/>
+              </w:rPr>
+            </w:pPr>
+            <w:r>
+              <w:rPr>
+                <w:rFonts w:ascii="Calibri" w:hAnsi="Calibri" w:cs="Arial"/>
+                <w:i/>
+                <w:sz w:val="18"/>
+                <w:szCs w:val="20"/>
+                <w:lang w:eastAsia="es-CL"/>
+              </w:rPr>
+              <w:t xml:space="preserve">Esta experiencia permitió fortalecer los conocimientos relacionados con la integración de API externas, la comunicación entre </w:t>
+            </w:r>
+            <w:proofErr w:type="spellStart"/>
+            <w:r>
+              <w:rPr>
+                <w:rFonts w:ascii="Calibri" w:hAnsi="Calibri" w:cs="Arial"/>
+                <w:i/>
+                <w:sz w:val="18"/>
+                <w:szCs w:val="20"/>
+                <w:lang w:eastAsia="es-CL"/>
+              </w:rPr>
+              <w:t>frontend</w:t>
+            </w:r>
+            <w:proofErr w:type="spellEnd"/>
+            <w:r>
+              <w:rPr>
+                <w:rFonts w:ascii="Calibri" w:hAnsi="Calibri" w:cs="Arial"/>
+                <w:i/>
+                <w:sz w:val="18"/>
+                <w:szCs w:val="20"/>
+                <w:lang w:eastAsia="es-CL"/>
+              </w:rPr>
+              <w:t xml:space="preserve"> y </w:t>
+            </w:r>
+            <w:proofErr w:type="spellStart"/>
+            <w:r>
+              <w:rPr>
+                <w:rFonts w:ascii="Calibri" w:hAnsi="Calibri" w:cs="Arial"/>
+                <w:i/>
+                <w:sz w:val="18"/>
+                <w:szCs w:val="20"/>
+                <w:lang w:eastAsia="es-CL"/>
+              </w:rPr>
+              <w:t>backend</w:t>
+            </w:r>
+            <w:proofErr w:type="spellEnd"/>
+            <w:r>
+              <w:rPr>
+                <w:rFonts w:ascii="Calibri" w:hAnsi="Calibri" w:cs="Arial"/>
+                <w:i/>
+                <w:sz w:val="18"/>
+                <w:szCs w:val="20"/>
+                <w:lang w:eastAsia="es-CL"/>
+              </w:rPr>
+              <w:t>, la identificación de errores y la realización de pruebas funcionales.</w:t>
+            </w:r>
+          </w:p>
+          <w:p>
+            <w:pPr>
+              <w:spacing w:after="0" w:line="240" w:lineRule="auto"/>
+              <w:jc w:val="both"/>
+              <w:rPr>
+                <w:rFonts w:ascii="Calibri" w:hAnsi="Calibri" w:cs="Arial"/>
+                <w:i/>
+                <w:sz w:val="18"/>
+                <w:szCs w:val="20"/>
+                <w:lang w:eastAsia="es-CL"/>
+              </w:rPr>
+            </w:pPr>
+          </w:p>
+          <w:p>
+            <w:pPr>
+              <w:spacing w:after="0" w:line="240" w:lineRule="auto"/>
+              <w:jc w:val="both"/>
+              <w:rPr>
+                <w:rFonts w:ascii="Calibri" w:hAnsi="Calibri" w:cs="Arial"/>
+                <w:i/>
+                <w:sz w:val="18"/>
+                <w:szCs w:val="20"/>
+                <w:lang w:eastAsia="es-CL"/>
+              </w:rPr>
+            </w:pPr>
+            <w:r>
+              <w:rPr>
+                <w:rFonts w:ascii="Calibri" w:hAnsi="Calibri" w:cs="Arial"/>
+                <w:i/>
+                <w:sz w:val="18"/>
+                <w:szCs w:val="20"/>
+                <w:lang w:eastAsia="es-CL"/>
+              </w:rPr>
+              <w:t>Además, los ajustes realizados permitieron avanzar en uno de los objetivos del proyecto, correspondiente a la implementación de un mecanismo de pago dentro de la plataforma, manteniendo su funcionamiento en un entorno controlado de pruebas.</w:t>
+            </w:r>
+          </w:p>
+          <w:p>
+            <w:pPr>
+              <w:spacing w:after="0" w:line="240" w:lineRule="auto"/>
+              <w:jc w:val="both"/>
+              <w:rPr>
+                <w:rFonts w:ascii="Calibri" w:hAnsi="Calibri" w:cs="Arial"/>
+                <w:i/>
+                <w:color w:val="0070C0"/>
+                <w:sz w:val="18"/>
+                <w:szCs w:val="20"/>
+                <w:lang w:eastAsia="es-CL"/>
+              </w:rPr>
+            </w:pPr>
+          </w:p>
+          <w:p>
+            <w:pPr>
+              <w:pStyle w:val="Prrafodelista"/>
+              <w:spacing w:after="0" w:line="240" w:lineRule="auto"/>
+              <w:ind w:left="318"/>
+              <w:jc w:val="both"/>
+              <w:rPr>
+                <w:rFonts w:ascii="Calibri" w:hAnsi="Calibri" w:cs="Arial"/>
+                <w:i/>
+                <w:color w:val="0070C0"/>
+                <w:sz w:val="18"/>
+                <w:szCs w:val="20"/>
+                <w:lang w:eastAsia="es-CL"/>
+              </w:rPr>
+            </w:pPr>
+          </w:p>
+          <w:p>
+            <w:pPr>
               <w:pStyle w:val="Prrafodelista"/>
               <w:numPr>
                 <w:ilvl w:val="0"/>
@@ -1960,6 +3301,7 @@
                 <w:color w:val="1F3864" w:themeColor="accent1" w:themeShade="80"/>
                 <w:sz w:val="18"/>
               </w:rPr>
+              <w:lastRenderedPageBreak/>
               <w:t>5. Evidencias</w:t>
             </w:r>
           </w:p>
@@ -1971,13 +3313,235 @@
           </w:tcPr>
           <w:p>
             <w:pPr>
-              <w:pStyle w:val="Prrafodelista"/>
-              <w:numPr>
-                <w:ilvl w:val="0"/>
-                <w:numId w:val="1"/>
-              </w:numPr>
               <w:spacing w:after="0" w:line="240" w:lineRule="auto"/>
-              <w:ind w:left="314" w:hanging="284"/>
+              <w:jc w:val="both"/>
+              <w:rPr>
+                <w:rFonts w:ascii="Calibri" w:hAnsi="Calibri" w:cs="Arial"/>
+                <w:i/>
+                <w:iCs/>
+                <w:color w:val="0070C0"/>
+                <w:sz w:val="18"/>
+                <w:szCs w:val="20"/>
+                <w:lang w:eastAsia="es-CL"/>
+              </w:rPr>
+            </w:pPr>
+            <w:r>
+              <w:rPr>
+                <w:rFonts w:ascii="Calibri" w:hAnsi="Calibri" w:cs="Arial"/>
+                <w:i/>
+                <w:iCs/>
+                <w:color w:val="0070C0"/>
+                <w:sz w:val="18"/>
+                <w:szCs w:val="20"/>
+                <w:lang w:eastAsia="es-CL"/>
+              </w:rPr>
+              <w:drawing>
+                <wp:inline distT="0" distB="0" distL="0" distR="0" wp14:anchorId="552270CF" wp14:editId="0C1605BD">
+                  <wp:extent cx="1320925" cy="2871504"/>
+                  <wp:effectExtent l="0" t="0" r="0" b="5080"/>
+                  <wp:docPr id="539562257" name="Imagen 4"/>
+                  <wp:cNvGraphicFramePr>
+                    <a:graphicFrameLocks xmlns:a="http://schemas.openxmlformats.org/drawingml/2006/main" noChangeAspect="1"/>
+                  </wp:cNvGraphicFramePr>
+                  <a:graphic xmlns:a="http://schemas.openxmlformats.org/drawingml/2006/main">
+                    <a:graphicData uri="http://schemas.openxmlformats.org/drawingml/2006/picture">
+                      <pic:pic xmlns:pic="http://schemas.openxmlformats.org/drawingml/2006/picture">
+                        <pic:nvPicPr>
+                          <pic:cNvPr id="0" name="Picture 6"/>
+                          <pic:cNvPicPr>
+                            <a:picLocks noChangeAspect="1" noChangeArrowheads="1"/>
+                          </pic:cNvPicPr>
+                        </pic:nvPicPr>
+                        <pic:blipFill>
+                          <a:blip r:embed="rId11" cstate="print">
+                            <a:extLst>
+                              <a:ext uri="{28A0092B-C50C-407E-A947-70E740481C1C}">
+                                <a14:useLocalDpi xmlns:a14="http://schemas.microsoft.com/office/drawing/2010/main" val="0"/>
+                              </a:ext>
+                            </a:extLst>
+                          </a:blip>
+                          <a:srcRect/>
+                          <a:stretch>
+                            <a:fillRect/>
+                          </a:stretch>
+                        </pic:blipFill>
+                        <pic:spPr bwMode="auto">
+                          <a:xfrm>
+                            <a:off x="0" y="0"/>
+                            <a:ext cx="1320925" cy="2871504"/>
+                          </a:xfrm>
+                          <a:prstGeom prst="rect">
+                            <a:avLst/>
+                          </a:prstGeom>
+                          <a:noFill/>
+                          <a:ln>
+                            <a:noFill/>
+                          </a:ln>
+                        </pic:spPr>
+                      </pic:pic>
+                    </a:graphicData>
+                  </a:graphic>
+                </wp:inline>
+              </w:drawing>
+            </w:r>
+            <w:r>
+              <w:rPr>
+                <w:rFonts w:ascii="Calibri" w:hAnsi="Calibri" w:cs="Arial"/>
+                <w:i/>
+                <w:iCs/>
+                <w:color w:val="0070C0"/>
+                <w:sz w:val="18"/>
+                <w:szCs w:val="20"/>
+                <w:lang w:eastAsia="es-CL"/>
+              </w:rPr>
+              <w:t xml:space="preserve">    </w:t>
+            </w:r>
+            <w:r>
+              <w:rPr>
+                <w:rFonts w:ascii="Calibri" w:hAnsi="Calibri" w:cs="Arial"/>
+                <w:i/>
+                <w:iCs/>
+                <w:color w:val="0070C0"/>
+                <w:sz w:val="18"/>
+                <w:szCs w:val="20"/>
+                <w:lang w:eastAsia="es-CL"/>
+              </w:rPr>
+              <w:drawing>
+                <wp:inline distT="0" distB="0" distL="0" distR="0" wp14:anchorId="54E8D64F" wp14:editId="043ADCD9">
+                  <wp:extent cx="1167765" cy="2913585"/>
+                  <wp:effectExtent l="0" t="0" r="0" b="1270"/>
+                  <wp:docPr id="1271158777" name="Imagen 6"/>
+                  <wp:cNvGraphicFramePr>
+                    <a:graphicFrameLocks xmlns:a="http://schemas.openxmlformats.org/drawingml/2006/main" noChangeAspect="1"/>
+                  </wp:cNvGraphicFramePr>
+                  <a:graphic xmlns:a="http://schemas.openxmlformats.org/drawingml/2006/main">
+                    <a:graphicData uri="http://schemas.openxmlformats.org/drawingml/2006/picture">
+                      <pic:pic xmlns:pic="http://schemas.openxmlformats.org/drawingml/2006/picture">
+                        <pic:nvPicPr>
+                          <pic:cNvPr id="0" name="Picture 13"/>
+                          <pic:cNvPicPr>
+                            <a:picLocks noChangeAspect="1" noChangeArrowheads="1"/>
+                          </pic:cNvPicPr>
+                        </pic:nvPicPr>
+                        <pic:blipFill>
+                          <a:blip r:embed="rId12" cstate="print">
+                            <a:extLst>
+                              <a:ext uri="{28A0092B-C50C-407E-A947-70E740481C1C}">
+                                <a14:useLocalDpi xmlns:a14="http://schemas.microsoft.com/office/drawing/2010/main" val="0"/>
+                              </a:ext>
+                            </a:extLst>
+                          </a:blip>
+                          <a:srcRect/>
+                          <a:stretch>
+                            <a:fillRect/>
+                          </a:stretch>
+                        </pic:blipFill>
+                        <pic:spPr bwMode="auto">
+                          <a:xfrm>
+                            <a:off x="0" y="0"/>
+                            <a:ext cx="1179430" cy="2942689"/>
+                          </a:xfrm>
+                          <a:prstGeom prst="rect">
+                            <a:avLst/>
+                          </a:prstGeom>
+                          <a:noFill/>
+                          <a:ln>
+                            <a:noFill/>
+                          </a:ln>
+                        </pic:spPr>
+                      </pic:pic>
+                    </a:graphicData>
+                  </a:graphic>
+                </wp:inline>
+              </w:drawing>
+            </w:r>
+            <w:r>
+              <w:rPr>
+                <w:noProof/>
+              </w:rPr>
+              <w:t xml:space="preserve"> </w:t>
+            </w:r>
+            <w:r>
+              <w:rPr>
+                <w:rFonts w:ascii="Calibri" w:hAnsi="Calibri" w:cs="Arial"/>
+                <w:i/>
+                <w:iCs/>
+                <w:color w:val="0070C0"/>
+                <w:sz w:val="18"/>
+                <w:szCs w:val="20"/>
+                <w:lang w:eastAsia="es-CL"/>
+              </w:rPr>
+              <w:drawing>
+                <wp:inline distT="0" distB="0" distL="0" distR="0" wp14:anchorId="4D9F8F17" wp14:editId="1C74B285">
+                  <wp:extent cx="1523894" cy="2956560"/>
+                  <wp:effectExtent l="0" t="0" r="635" b="0"/>
+                  <wp:docPr id="804960843" name="Imagen 1"/>
+                  <wp:cNvGraphicFramePr>
+                    <a:graphicFrameLocks xmlns:a="http://schemas.openxmlformats.org/drawingml/2006/main" noChangeAspect="1"/>
+                  </wp:cNvGraphicFramePr>
+                  <a:graphic xmlns:a="http://schemas.openxmlformats.org/drawingml/2006/main">
+                    <a:graphicData uri="http://schemas.openxmlformats.org/drawingml/2006/picture">
+                      <pic:pic xmlns:pic="http://schemas.openxmlformats.org/drawingml/2006/picture">
+                        <pic:nvPicPr>
+                          <pic:cNvPr id="804960843" name=""/>
+                          <pic:cNvPicPr/>
+                        </pic:nvPicPr>
+                        <pic:blipFill>
+                          <a:blip r:embed="rId13"/>
+                          <a:stretch>
+                            <a:fillRect/>
+                          </a:stretch>
+                        </pic:blipFill>
+                        <pic:spPr>
+                          <a:xfrm>
+                            <a:off x="0" y="0"/>
+                            <a:ext cx="1534336" cy="2976818"/>
+                          </a:xfrm>
+                          <a:prstGeom prst="rect">
+                            <a:avLst/>
+                          </a:prstGeom>
+                        </pic:spPr>
+                      </pic:pic>
+                    </a:graphicData>
+                  </a:graphic>
+                </wp:inline>
+              </w:drawing>
+            </w:r>
+          </w:p>
+          <w:p>
+            <w:pPr>
+              <w:spacing w:after="0" w:line="240" w:lineRule="auto"/>
+              <w:jc w:val="both"/>
+              <w:rPr>
+                <w:rFonts w:ascii="Calibri" w:hAnsi="Calibri" w:cs="Arial"/>
+                <w:i/>
+                <w:iCs/>
+                <w:color w:val="0070C0"/>
+                <w:sz w:val="18"/>
+                <w:szCs w:val="20"/>
+                <w:lang w:eastAsia="es-CL"/>
+              </w:rPr>
+            </w:pPr>
+          </w:p>
+          <w:p>
+            <w:pPr>
+              <w:spacing w:after="0" w:line="240" w:lineRule="auto"/>
+              <w:jc w:val="both"/>
+              <w:rPr>
+                <w:rFonts w:ascii="Calibri" w:hAnsi="Calibri" w:cs="Arial"/>
+                <w:i/>
+                <w:iCs/>
+                <w:color w:val="0070C0"/>
+                <w:sz w:val="18"/>
+                <w:szCs w:val="20"/>
+                <w:lang w:eastAsia="es-CL"/>
+              </w:rPr>
+            </w:pPr>
+          </w:p>
+          <w:p>
+            <w:pPr>
+              <w:spacing w:after="0" w:line="240" w:lineRule="auto"/>
+              <w:ind w:left="30"/>
               <w:jc w:val="both"/>
               <w:rPr>
                 <w:rFonts w:ascii="Calibri" w:hAnsi="Calibri" w:cs="Arial"/>
@@ -2334,7 +3898,7 @@
     </w:p>
     <w:p/>
     <w:sectPr>
-      <w:headerReference w:type="default" r:id="rId11"/>
+      <w:headerReference w:type="default" r:id="rId14"/>
       <w:pgSz w:w="11906" w:h="16838"/>
       <w:pgMar w:top="1417" w:right="1701" w:bottom="1417" w:left="1701" w:header="708" w:footer="708" w:gutter="0"/>
       <w:cols w:space="708"/>
@@ -2345,7 +3909,7 @@
 </file>
 
 <file path=word/endnotes.xml><?xml version="1.0" encoding="utf-8"?>
-<w:endnotes xmlns:wpc="http://schemas.microsoft.com/office/word/2010/wordprocessingCanvas" xmlns:cx="http://schemas.microsoft.com/office/drawing/2014/chartex" xmlns:mc="http://schemas.openxmlformats.org/markup-compatibility/2006" xmlns:o="urn:schemas-microsoft-com:office:office" xmlns:r="http://schemas.openxmlformats.org/officeDocument/2006/relationships" xmlns:m="http://schemas.openxmlformats.org/officeDocument/2006/math" xmlns:v="urn:schemas-microsoft-com:vml" xmlns:wp14="http://schemas.microsoft.com/office/word/2010/wordprocessingDrawing" xmlns:wp="http://schemas.openxmlformats.org/drawingml/2006/wordprocessingDrawing" xmlns:w10="urn:schemas-microsoft-com:office:word" xmlns:w="http://schemas.openxmlformats.org/wordprocessingml/2006/main" xmlns:w14="http://schemas.microsoft.com/office/word/2010/wordml" xmlns:w15="http://schemas.microsoft.com/office/word/2012/wordml" xmlns:w16se="http://schemas.microsoft.com/office/word/2015/wordml/symex" xmlns:wpg="http://schemas.microsoft.com/office/word/2010/wordprocessingGroup" xmlns:wpi="http://schemas.microsoft.com/office/word/2010/wordprocessingInk" xmlns:wne="http://schemas.microsoft.com/office/word/2006/wordml" xmlns:wps="http://schemas.microsoft.com/office/word/2010/wordprocessingShape" mc:Ignorable="w14 w15 w16se wp14">
+<w:endnotes xmlns:wpc="http://schemas.microsoft.com/office/word/2010/wordprocessingCanvas" xmlns:cx="http://schemas.microsoft.com/office/drawing/2014/chartex" xmlns:cx1="http://schemas.microsoft.com/office/drawing/2015/9/8/chartex" xmlns:cx2="http://schemas.microsoft.com/office/drawing/2015/10/21/chartex" xmlns:cx3="http://schemas.microsoft.com/office/drawing/2016/5/9/chartex" xmlns:cx4="http://schemas.microsoft.com/office/drawing/2016/5/10/chartex" xmlns:cx5="http://schemas.microsoft.com/office/drawing/2016/5/11/chartex" xmlns:cx6="http://schemas.microsoft.com/office/drawing/2016/5/12/chartex" xmlns:cx7="http://schemas.microsoft.com/office/drawing/2016/5/13/chartex" xmlns:cx8="http://schemas.microsoft.com/office/drawing/2016/5/14/chartex" xmlns:mc="http://schemas.openxmlformats.org/markup-compatibility/2006" xmlns:aink="http://schemas.microsoft.com/office/drawing/2016/ink" xmlns:am3d="http://schemas.microsoft.com/office/drawing/2017/model3d" xmlns:o="urn:schemas-microsoft-com:office:office" xmlns:oel="http://schemas.microsoft.com/office/2019/extlst" xmlns:r="http://schemas.openxmlformats.org/officeDocument/2006/relationships" xmlns:m="http://schemas.openxmlformats.org/officeDocument/2006/math" xmlns:v="urn:schemas-microsoft-com:vml" xmlns:wp14="http://schemas.microsoft.com/office/word/2010/wordprocessingDrawing" xmlns:wp="http://schemas.openxmlformats.org/drawingml/2006/wordprocessingDrawing" xmlns:w10="urn:schemas-microsoft-com:office:word" xmlns:w="http://schemas.openxmlformats.org/wordprocessingml/2006/main" xmlns:w14="http://schemas.microsoft.com/office/word/2010/wordml" xmlns:w15="http://schemas.microsoft.com/office/word/2012/wordml" xmlns:w16cex="http://schemas.microsoft.com/office/word/2018/wordml/cex" xmlns:w16cid="http://schemas.microsoft.com/office/word/2016/wordml/cid" xmlns:w16="http://schemas.microsoft.com/office/word/2018/wordml" xmlns:w16du="http://schemas.microsoft.com/office/word/2023/wordml/word16du" xmlns:w16sdtdh="http://schemas.microsoft.com/office/word/2020/wordml/sdtdatahash" xmlns:w16sdtfl="http://schemas.microsoft.com/office/word/2024/wordml/sdtformatlock" xmlns:w16se="http://schemas.microsoft.com/office/word/2015/wordml/symex" xmlns:wpg="http://schemas.microsoft.com/office/word/2010/wordprocessingGroup" xmlns:wpi="http://schemas.microsoft.com/office/word/2010/wordprocessingInk" xmlns:wne="http://schemas.microsoft.com/office/word/2006/wordml" xmlns:wps="http://schemas.microsoft.com/office/word/2010/wordprocessingShape" mc:Ignorable="w14 w15 w16se w16cid w16 w16cex w16sdtdh w16sdtfl w16du wp14">
   <w:endnote w:type="separator" w:id="-1">
     <w:p>
       <w:pPr>
@@ -2370,7 +3934,7 @@
 </file>
 
 <file path=word/footnotes.xml><?xml version="1.0" encoding="utf-8"?>
-<w:footnotes xmlns:wpc="http://schemas.microsoft.com/office/word/2010/wordprocessingCanvas" xmlns:cx="http://schemas.microsoft.com/office/drawing/2014/chartex" xmlns:mc="http://schemas.openxmlformats.org/markup-compatibility/2006" xmlns:o="urn:schemas-microsoft-com:office:office" xmlns:r="http://schemas.openxmlformats.org/officeDocument/2006/relationships" xmlns:m="http://schemas.openxmlformats.org/officeDocument/2006/math" xmlns:v="urn:schemas-microsoft-com:vml" xmlns:wp14="http://schemas.microsoft.com/office/word/2010/wordprocessingDrawing" xmlns:wp="http://schemas.openxmlformats.org/drawingml/2006/wordprocessingDrawing" xmlns:w10="urn:schemas-microsoft-com:office:word" xmlns:w="http://schemas.openxmlformats.org/wordprocessingml/2006/main" xmlns:w14="http://schemas.microsoft.com/office/word/2010/wordml" xmlns:w15="http://schemas.microsoft.com/office/word/2012/wordml" xmlns:w16se="http://schemas.microsoft.com/office/word/2015/wordml/symex" xmlns:wpg="http://schemas.microsoft.com/office/word/2010/wordprocessingGroup" xmlns:wpi="http://schemas.microsoft.com/office/word/2010/wordprocessingInk" xmlns:wne="http://schemas.microsoft.com/office/word/2006/wordml" xmlns:wps="http://schemas.microsoft.com/office/word/2010/wordprocessingShape" mc:Ignorable="w14 w15 w16se wp14">
+<w:footnotes xmlns:wpc="http://schemas.microsoft.com/office/word/2010/wordprocessingCanvas" xmlns:cx="http://schemas.microsoft.com/office/drawing/2014/chartex" xmlns:cx1="http://schemas.microsoft.com/office/drawing/2015/9/8/chartex" xmlns:cx2="http://schemas.microsoft.com/office/drawing/2015/10/21/chartex" xmlns:cx3="http://schemas.microsoft.com/office/drawing/2016/5/9/chartex" xmlns:cx4="http://schemas.microsoft.com/office/drawing/2016/5/10/chartex" xmlns:cx5="http://schemas.microsoft.com/office/drawing/2016/5/11/chartex" xmlns:cx6="http://schemas.microsoft.com/office/drawing/2016/5/12/chartex" xmlns:cx7="http://schemas.microsoft.com/office/drawing/2016/5/13/chartex" xmlns:cx8="http://schemas.microsoft.com/office/drawing/2016/5/14/chartex" xmlns:mc="http://schemas.openxmlformats.org/markup-compatibility/2006" xmlns:aink="http://schemas.microsoft.com/office/drawing/2016/ink" xmlns:am3d="http://schemas.microsoft.com/office/drawing/2017/model3d" xmlns:o="urn:schemas-microsoft-com:office:office" xmlns:oel="http://schemas.microsoft.com/office/2019/extlst" xmlns:r="http://schemas.openxmlformats.org/officeDocument/2006/relationships" xmlns:m="http://schemas.openxmlformats.org/officeDocument/2006/math" xmlns:v="urn:schemas-microsoft-com:vml" xmlns:wp14="http://schemas.microsoft.com/office/word/2010/wordprocessingDrawing" xmlns:wp="http://schemas.openxmlformats.org/drawingml/2006/wordprocessingDrawing" xmlns:w10="urn:schemas-microsoft-com:office:word" xmlns:w="http://schemas.openxmlformats.org/wordprocessingml/2006/main" xmlns:w14="http://schemas.microsoft.com/office/word/2010/wordml" xmlns:w15="http://schemas.microsoft.com/office/word/2012/wordml" xmlns:w16cex="http://schemas.microsoft.com/office/word/2018/wordml/cex" xmlns:w16cid="http://schemas.microsoft.com/office/word/2016/wordml/cid" xmlns:w16="http://schemas.microsoft.com/office/word/2018/wordml" xmlns:w16du="http://schemas.microsoft.com/office/word/2023/wordml/word16du" xmlns:w16sdtdh="http://schemas.microsoft.com/office/word/2020/wordml/sdtdatahash" xmlns:w16sdtfl="http://schemas.microsoft.com/office/word/2024/wordml/sdtformatlock" xmlns:w16se="http://schemas.microsoft.com/office/word/2015/wordml/symex" xmlns:wpg="http://schemas.microsoft.com/office/word/2010/wordprocessingGroup" xmlns:wpi="http://schemas.microsoft.com/office/word/2010/wordprocessingInk" xmlns:wne="http://schemas.microsoft.com/office/word/2006/wordml" xmlns:wps="http://schemas.microsoft.com/office/word/2010/wordprocessingShape" mc:Ignorable="w14 w15 w16se w16cid w16 w16cex w16sdtdh w16sdtfl w16du wp14">
   <w:footnote w:type="separator" w:id="-1">
     <w:p>
       <w:pPr>
@@ -2395,7 +3959,7 @@
 </file>
 
 <file path=word/header1.xml><?xml version="1.0" encoding="utf-8"?>
-<w:hdr xmlns:wpc="http://schemas.microsoft.com/office/word/2010/wordprocessingCanvas" xmlns:cx="http://schemas.microsoft.com/office/drawing/2014/chartex" xmlns:mc="http://schemas.openxmlformats.org/markup-compatibility/2006" xmlns:o="urn:schemas-microsoft-com:office:office" xmlns:r="http://schemas.openxmlformats.org/officeDocument/2006/relationships" xmlns:m="http://schemas.openxmlformats.org/officeDocument/2006/math" xmlns:v="urn:schemas-microsoft-com:vml" xmlns:wp14="http://schemas.microsoft.com/office/word/2010/wordprocessingDrawing" xmlns:wp="http://schemas.openxmlformats.org/drawingml/2006/wordprocessingDrawing" xmlns:w10="urn:schemas-microsoft-com:office:word" xmlns:w="http://schemas.openxmlformats.org/wordprocessingml/2006/main" xmlns:w14="http://schemas.microsoft.com/office/word/2010/wordml" xmlns:w15="http://schemas.microsoft.com/office/word/2012/wordml" xmlns:w16se="http://schemas.microsoft.com/office/word/2015/wordml/symex" xmlns:wpg="http://schemas.microsoft.com/office/word/2010/wordprocessingGroup" xmlns:wpi="http://schemas.microsoft.com/office/word/2010/wordprocessingInk" xmlns:wne="http://schemas.microsoft.com/office/word/2006/wordml" xmlns:wps="http://schemas.microsoft.com/office/word/2010/wordprocessingShape" mc:Ignorable="w14 w15 w16se wp14">
+<w:hdr xmlns:wpc="http://schemas.microsoft.com/office/word/2010/wordprocessingCanvas" xmlns:cx="http://schemas.microsoft.com/office/drawing/2014/chartex" xmlns:cx1="http://schemas.microsoft.com/office/drawing/2015/9/8/chartex" xmlns:cx2="http://schemas.microsoft.com/office/drawing/2015/10/21/chartex" xmlns:cx3="http://schemas.microsoft.com/office/drawing/2016/5/9/chartex" xmlns:cx4="http://schemas.microsoft.com/office/drawing/2016/5/10/chartex" xmlns:cx5="http://schemas.microsoft.com/office/drawing/2016/5/11/chartex" xmlns:cx6="http://schemas.microsoft.com/office/drawing/2016/5/12/chartex" xmlns:cx7="http://schemas.microsoft.com/office/drawing/2016/5/13/chartex" xmlns:cx8="http://schemas.microsoft.com/office/drawing/2016/5/14/chartex" xmlns:mc="http://schemas.openxmlformats.org/markup-compatibility/2006" xmlns:aink="http://schemas.microsoft.com/office/drawing/2016/ink" xmlns:am3d="http://schemas.microsoft.com/office/drawing/2017/model3d" xmlns:o="urn:schemas-microsoft-com:office:office" xmlns:oel="http://schemas.microsoft.com/office/2019/extlst" xmlns:r="http://schemas.openxmlformats.org/officeDocument/2006/relationships" xmlns:m="http://schemas.openxmlformats.org/officeDocument/2006/math" xmlns:v="urn:schemas-microsoft-com:vml" xmlns:wp14="http://schemas.microsoft.com/office/word/2010/wordprocessingDrawing" xmlns:wp="http://schemas.openxmlformats.org/drawingml/2006/wordprocessingDrawing" xmlns:w10="urn:schemas-microsoft-com:office:word" xmlns:w="http://schemas.openxmlformats.org/wordprocessingml/2006/main" xmlns:w14="http://schemas.microsoft.com/office/word/2010/wordml" xmlns:w15="http://schemas.microsoft.com/office/word/2012/wordml" xmlns:w16cex="http://schemas.microsoft.com/office/word/2018/wordml/cex" xmlns:w16cid="http://schemas.microsoft.com/office/word/2016/wordml/cid" xmlns:w16="http://schemas.microsoft.com/office/word/2018/wordml" xmlns:w16du="http://schemas.microsoft.com/office/word/2023/wordml/word16du" xmlns:w16sdtdh="http://schemas.microsoft.com/office/word/2020/wordml/sdtdatahash" xmlns:w16sdtfl="http://schemas.microsoft.com/office/word/2024/wordml/sdtformatlock" xmlns:w16se="http://schemas.microsoft.com/office/word/2015/wordml/symex" xmlns:wpg="http://schemas.microsoft.com/office/word/2010/wordprocessingGroup" xmlns:wpi="http://schemas.microsoft.com/office/word/2010/wordprocessingInk" xmlns:wne="http://schemas.microsoft.com/office/word/2006/wordml" xmlns:wps="http://schemas.microsoft.com/office/word/2010/wordprocessingShape" mc:Ignorable="w14 w15 w16se w16cid w16 w16cex w16sdtdh w16sdtfl w16du wp14">
   <w:tbl>
     <w:tblPr>
       <w:tblStyle w:val="Tablaconcuadrcula1"/>
@@ -2620,8 +4184,157 @@
 </file>
 
 <file path=word/numbering.xml><?xml version="1.0" encoding="utf-8"?>
-<w:numbering xmlns:wpc="http://schemas.microsoft.com/office/word/2010/wordprocessingCanvas" xmlns:cx="http://schemas.microsoft.com/office/drawing/2014/chartex" xmlns:mc="http://schemas.openxmlformats.org/markup-compatibility/2006" xmlns:o="urn:schemas-microsoft-com:office:office" xmlns:r="http://schemas.openxmlformats.org/officeDocument/2006/relationships" xmlns:m="http://schemas.openxmlformats.org/officeDocument/2006/math" xmlns:v="urn:schemas-microsoft-com:vml" xmlns:wp14="http://schemas.microsoft.com/office/word/2010/wordprocessingDrawing" xmlns:wp="http://schemas.openxmlformats.org/drawingml/2006/wordprocessingDrawing" xmlns:w10="urn:schemas-microsoft-com:office:word" xmlns:w="http://schemas.openxmlformats.org/wordprocessingml/2006/main" xmlns:w14="http://schemas.microsoft.com/office/word/2010/wordml" xmlns:w15="http://schemas.microsoft.com/office/word/2012/wordml" xmlns:w16se="http://schemas.microsoft.com/office/word/2015/wordml/symex" xmlns:wpg="http://schemas.microsoft.com/office/word/2010/wordprocessingGroup" xmlns:wpi="http://schemas.microsoft.com/office/word/2010/wordprocessingInk" xmlns:wne="http://schemas.microsoft.com/office/word/2006/wordml" xmlns:wps="http://schemas.microsoft.com/office/word/2010/wordprocessingShape" mc:Ignorable="w14 w15 w16se wp14">
+<w:numbering xmlns:wpc="http://schemas.microsoft.com/office/word/2010/wordprocessingCanvas" xmlns:cx="http://schemas.microsoft.com/office/drawing/2014/chartex" xmlns:cx1="http://schemas.microsoft.com/office/drawing/2015/9/8/chartex" xmlns:cx2="http://schemas.microsoft.com/office/drawing/2015/10/21/chartex" xmlns:cx3="http://schemas.microsoft.com/office/drawing/2016/5/9/chartex" xmlns:cx4="http://schemas.microsoft.com/office/drawing/2016/5/10/chartex" xmlns:cx5="http://schemas.microsoft.com/office/drawing/2016/5/11/chartex" xmlns:cx6="http://schemas.microsoft.com/office/drawing/2016/5/12/chartex" xmlns:cx7="http://schemas.microsoft.com/office/drawing/2016/5/13/chartex" xmlns:cx8="http://schemas.microsoft.com/office/drawing/2016/5/14/chartex" xmlns:mc="http://schemas.openxmlformats.org/markup-compatibility/2006" xmlns:aink="http://schemas.microsoft.com/office/drawing/2016/ink" xmlns:am3d="http://schemas.microsoft.com/office/drawing/2017/model3d" xmlns:o="urn:schemas-microsoft-com:office:office" xmlns:oel="http://schemas.microsoft.com/office/2019/extlst" xmlns:r="http://schemas.openxmlformats.org/officeDocument/2006/relationships" xmlns:m="http://schemas.openxmlformats.org/officeDocument/2006/math" xmlns:v="urn:schemas-microsoft-com:vml" xmlns:wp14="http://schemas.microsoft.com/office/word/2010/wordprocessingDrawing" xmlns:wp="http://schemas.openxmlformats.org/drawingml/2006/wordprocessingDrawing" xmlns:w10="urn:schemas-microsoft-com:office:word" xmlns:w="http://schemas.openxmlformats.org/wordprocessingml/2006/main" xmlns:w14="http://schemas.microsoft.com/office/word/2010/wordml" xmlns:w15="http://schemas.microsoft.com/office/word/2012/wordml" xmlns:w16cex="http://schemas.microsoft.com/office/word/2018/wordml/cex" xmlns:w16cid="http://schemas.microsoft.com/office/word/2016/wordml/cid" xmlns:w16="http://schemas.microsoft.com/office/word/2018/wordml" xmlns:w16du="http://schemas.microsoft.com/office/word/2023/wordml/word16du" xmlns:w16sdtdh="http://schemas.microsoft.com/office/word/2020/wordml/sdtdatahash" xmlns:w16sdtfl="http://schemas.microsoft.com/office/word/2024/wordml/sdtformatlock" xmlns:w16se="http://schemas.microsoft.com/office/word/2015/wordml/symex" xmlns:wpg="http://schemas.microsoft.com/office/word/2010/wordprocessingGroup" xmlns:wpi="http://schemas.microsoft.com/office/word/2010/wordprocessingInk" xmlns:wne="http://schemas.microsoft.com/office/word/2006/wordml" xmlns:wps="http://schemas.microsoft.com/office/word/2010/wordprocessingShape" mc:Ignorable="w14 w15 w16se w16cid w16 w16cex w16sdtdh w16sdtfl w16du wp14">
   <w:abstractNum w:abstractNumId="0" w15:restartNumberingAfterBreak="0">
+    <w:nsid w:val="01217D7C"/>
+    <w:multiLevelType w:val="multilevel"/>
+    <w:tmpl w:val="A3881620"/>
+    <w:lvl w:ilvl="0">
+      <w:start w:val="1"/>
+      <w:numFmt w:val="bullet"/>
+      <w:lvlText w:val=""/>
+      <w:lvlJc w:val="left"/>
+      <w:pPr>
+        <w:tabs>
+          <w:tab w:val="num" w:pos="720"/>
+        </w:tabs>
+        <w:ind w:left="720" w:hanging="360"/>
+      </w:pPr>
+      <w:rPr>
+        <w:rFonts w:ascii="Symbol" w:hAnsi="Symbol" w:hint="default"/>
+        <w:sz w:val="20"/>
+      </w:rPr>
+    </w:lvl>
+    <w:lvl w:ilvl="1" w:tentative="1">
+      <w:start w:val="1"/>
+      <w:numFmt w:val="bullet"/>
+      <w:lvlText w:val="o"/>
+      <w:lvlJc w:val="left"/>
+      <w:pPr>
+        <w:tabs>
+          <w:tab w:val="num" w:pos="1440"/>
+        </w:tabs>
+        <w:ind w:left="1440" w:hanging="360"/>
+      </w:pPr>
+      <w:rPr>
+        <w:rFonts w:ascii="Courier New" w:hAnsi="Courier New" w:hint="default"/>
+        <w:sz w:val="20"/>
+      </w:rPr>
+    </w:lvl>
+    <w:lvl w:ilvl="2" w:tentative="1">
+      <w:start w:val="1"/>
+      <w:numFmt w:val="bullet"/>
+      <w:lvlText w:val=""/>
+      <w:lvlJc w:val="left"/>
+      <w:pPr>
+        <w:tabs>
+          <w:tab w:val="num" w:pos="2160"/>
+        </w:tabs>
+        <w:ind w:left="2160" w:hanging="360"/>
+      </w:pPr>
+      <w:rPr>
+        <w:rFonts w:ascii="Wingdings" w:hAnsi="Wingdings" w:hint="default"/>
+        <w:sz w:val="20"/>
+      </w:rPr>
+    </w:lvl>
+    <w:lvl w:ilvl="3" w:tentative="1">
+      <w:start w:val="1"/>
+      <w:numFmt w:val="bullet"/>
+      <w:lvlText w:val=""/>
+      <w:lvlJc w:val="left"/>
+      <w:pPr>
+        <w:tabs>
+          <w:tab w:val="num" w:pos="2880"/>
+        </w:tabs>
+        <w:ind w:left="2880" w:hanging="360"/>
+      </w:pPr>
+      <w:rPr>
+        <w:rFonts w:ascii="Wingdings" w:hAnsi="Wingdings" w:hint="default"/>
+        <w:sz w:val="20"/>
+      </w:rPr>
+    </w:lvl>
+    <w:lvl w:ilvl="4" w:tentative="1">
+      <w:start w:val="1"/>
+      <w:numFmt w:val="bullet"/>
+      <w:lvlText w:val=""/>
+      <w:lvlJc w:val="left"/>
+      <w:pPr>
+        <w:tabs>
+          <w:tab w:val="num" w:pos="3600"/>
+        </w:tabs>
+        <w:ind w:left="3600" w:hanging="360"/>
+      </w:pPr>
+      <w:rPr>
+        <w:rFonts w:ascii="Wingdings" w:hAnsi="Wingdings" w:hint="default"/>
+        <w:sz w:val="20"/>
+      </w:rPr>
+    </w:lvl>
+    <w:lvl w:ilvl="5" w:tentative="1">
+      <w:start w:val="1"/>
+      <w:numFmt w:val="bullet"/>
+      <w:lvlText w:val=""/>
+      <w:lvlJc w:val="left"/>
+      <w:pPr>
+        <w:tabs>
+          <w:tab w:val="num" w:pos="4320"/>
+        </w:tabs>
+        <w:ind w:left="4320" w:hanging="360"/>
+      </w:pPr>
+      <w:rPr>
+        <w:rFonts w:ascii="Wingdings" w:hAnsi="Wingdings" w:hint="default"/>
+        <w:sz w:val="20"/>
+      </w:rPr>
+    </w:lvl>
+    <w:lvl w:ilvl="6" w:tentative="1">
+      <w:start w:val="1"/>
+      <w:numFmt w:val="bullet"/>
+      <w:lvlText w:val=""/>
+      <w:lvlJc w:val="left"/>
+      <w:pPr>
+        <w:tabs>
+          <w:tab w:val="num" w:pos="5040"/>
+        </w:tabs>
+        <w:ind w:left="5040" w:hanging="360"/>
+      </w:pPr>
+      <w:rPr>
+        <w:rFonts w:ascii="Wingdings" w:hAnsi="Wingdings" w:hint="default"/>
+        <w:sz w:val="20"/>
+      </w:rPr>
+    </w:lvl>
+    <w:lvl w:ilvl="7" w:tentative="1">
+      <w:start w:val="1"/>
+      <w:numFmt w:val="bullet"/>
+      <w:lvlText w:val=""/>
+      <w:lvlJc w:val="left"/>
+      <w:pPr>
+        <w:tabs>
+          <w:tab w:val="num" w:pos="5760"/>
+        </w:tabs>
+        <w:ind w:left="5760" w:hanging="360"/>
+      </w:pPr>
+      <w:rPr>
+        <w:rFonts w:ascii="Wingdings" w:hAnsi="Wingdings" w:hint="default"/>
+        <w:sz w:val="20"/>
+      </w:rPr>
+    </w:lvl>
+    <w:lvl w:ilvl="8" w:tentative="1">
+      <w:start w:val="1"/>
+      <w:numFmt w:val="bullet"/>
+      <w:lvlText w:val=""/>
+      <w:lvlJc w:val="left"/>
+      <w:pPr>
+        <w:tabs>
+          <w:tab w:val="num" w:pos="6480"/>
+        </w:tabs>
+        <w:ind w:left="6480" w:hanging="360"/>
+      </w:pPr>
+      <w:rPr>
+        <w:rFonts w:ascii="Wingdings" w:hAnsi="Wingdings" w:hint="default"/>
+        <w:sz w:val="20"/>
+      </w:rPr>
+    </w:lvl>
+  </w:abstractNum>
+  <w:abstractNum w:abstractNumId="1" w15:restartNumberingAfterBreak="0">
     <w:nsid w:val="114E14AF"/>
     <w:multiLevelType w:val="hybridMultilevel"/>
     <w:tmpl w:val="1E3E9D2A"/>
@@ -2734,7 +4447,7 @@
       </w:rPr>
     </w:lvl>
   </w:abstractNum>
-  <w:abstractNum w:abstractNumId="1" w15:restartNumberingAfterBreak="0">
+  <w:abstractNum w:abstractNumId="2" w15:restartNumberingAfterBreak="0">
     <w:nsid w:val="28446858"/>
     <w:multiLevelType w:val="multilevel"/>
     <w:tmpl w:val="9156115C"/>
@@ -2883,7 +4596,7 @@
       </w:rPr>
     </w:lvl>
   </w:abstractNum>
-  <w:abstractNum w:abstractNumId="2" w15:restartNumberingAfterBreak="0">
+  <w:abstractNum w:abstractNumId="3" w15:restartNumberingAfterBreak="0">
     <w:nsid w:val="2FFD4C7F"/>
     <w:multiLevelType w:val="multilevel"/>
     <w:tmpl w:val="CAF0F936"/>
@@ -3004,7 +4717,7 @@
       </w:rPr>
     </w:lvl>
   </w:abstractNum>
-  <w:abstractNum w:abstractNumId="3" w15:restartNumberingAfterBreak="0">
+  <w:abstractNum w:abstractNumId="4" w15:restartNumberingAfterBreak="0">
     <w:nsid w:val="51D05305"/>
     <w:multiLevelType w:val="hybridMultilevel"/>
     <w:tmpl w:val="630E86B8"/>
@@ -3117,7 +4830,7 @@
       </w:rPr>
     </w:lvl>
   </w:abstractNum>
-  <w:abstractNum w:abstractNumId="4" w15:restartNumberingAfterBreak="0">
+  <w:abstractNum w:abstractNumId="5" w15:restartNumberingAfterBreak="0">
     <w:nsid w:val="66494837"/>
     <w:multiLevelType w:val="hybridMultilevel"/>
     <w:tmpl w:val="68BA2608"/>
@@ -3230,7 +4943,7 @@
       </w:rPr>
     </w:lvl>
   </w:abstractNum>
-  <w:abstractNum w:abstractNumId="5" w15:restartNumberingAfterBreak="0">
+  <w:abstractNum w:abstractNumId="6" w15:restartNumberingAfterBreak="0">
     <w:nsid w:val="731E1176"/>
     <w:multiLevelType w:val="hybridMultilevel"/>
     <w:tmpl w:val="AF82A29E"/>
@@ -3320,29 +5033,32 @@
       </w:pPr>
     </w:lvl>
   </w:abstractNum>
-  <w:num w:numId="1">
-    <w:abstractNumId w:val="0"/>
+  <w:num w:numId="1" w16cid:durableId="327947061">
+    <w:abstractNumId w:val="1"/>
   </w:num>
-  <w:num w:numId="2">
+  <w:num w:numId="2" w16cid:durableId="951783506">
+    <w:abstractNumId w:val="3"/>
+  </w:num>
+  <w:num w:numId="3" w16cid:durableId="1905405791">
+    <w:abstractNumId w:val="6"/>
+  </w:num>
+  <w:num w:numId="4" w16cid:durableId="787043179">
     <w:abstractNumId w:val="2"/>
   </w:num>
-  <w:num w:numId="3">
+  <w:num w:numId="5" w16cid:durableId="1094519815">
+    <w:abstractNumId w:val="4"/>
+  </w:num>
+  <w:num w:numId="6" w16cid:durableId="1038816338">
     <w:abstractNumId w:val="5"/>
   </w:num>
-  <w:num w:numId="4">
-    <w:abstractNumId w:val="1"/>
-  </w:num>
-  <w:num w:numId="5">
-    <w:abstractNumId w:val="3"/>
-  </w:num>
-  <w:num w:numId="6">
-    <w:abstractNumId w:val="4"/>
+  <w:num w:numId="7" w16cid:durableId="662512449">
+    <w:abstractNumId w:val="0"/>
   </w:num>
 </w:numbering>
 </file>
 
 <file path=word/styles.xml><?xml version="1.0" encoding="utf-8"?>
-<w:styles xmlns:mc="http://schemas.openxmlformats.org/markup-compatibility/2006" xmlns:r="http://schemas.openxmlformats.org/officeDocument/2006/relationships" xmlns:w="http://schemas.openxmlformats.org/wordprocessingml/2006/main" xmlns:w14="http://schemas.microsoft.com/office/word/2010/wordml" xmlns:w15="http://schemas.microsoft.com/office/word/2012/wordml" xmlns:w16se="http://schemas.microsoft.com/office/word/2015/wordml/symex" mc:Ignorable="w14 w15 w16se">
+<w:styles xmlns:mc="http://schemas.openxmlformats.org/markup-compatibility/2006" xmlns:r="http://schemas.openxmlformats.org/officeDocument/2006/relationships" xmlns:w="http://schemas.openxmlformats.org/wordprocessingml/2006/main" xmlns:w14="http://schemas.microsoft.com/office/word/2010/wordml" xmlns:w15="http://schemas.microsoft.com/office/word/2012/wordml" xmlns:w16cex="http://schemas.microsoft.com/office/word/2018/wordml/cex" xmlns:w16cid="http://schemas.microsoft.com/office/word/2016/wordml/cid" xmlns:w16="http://schemas.microsoft.com/office/word/2018/wordml" xmlns:w16du="http://schemas.microsoft.com/office/word/2023/wordml/word16du" xmlns:w16sdtdh="http://schemas.microsoft.com/office/word/2020/wordml/sdtdatahash" xmlns:w16sdtfl="http://schemas.microsoft.com/office/word/2024/wordml/sdtformatlock" xmlns:w16se="http://schemas.microsoft.com/office/word/2015/wordml/symex" mc:Ignorable="w14 w15 w16se w16cid w16 w16cex w16sdtdh w16sdtfl w16du">
   <w:docDefaults>
     <w:rPrDefault>
       <w:rPr>
@@ -3354,7 +5070,7 @@
     </w:rPrDefault>
     <w:pPrDefault/>
   </w:docDefaults>
-  <w:latentStyles w:defLockedState="0" w:defUIPriority="99" w:defSemiHidden="0" w:defUnhideWhenUsed="0" w:defQFormat="0" w:count="371">
+  <w:latentStyles w:defLockedState="0" w:defUIPriority="99" w:defSemiHidden="0" w:defUnhideWhenUsed="0" w:defQFormat="0" w:count="376">
     <w:lsdException w:name="Normal" w:uiPriority="0" w:qFormat="1"/>
     <w:lsdException w:name="heading 1" w:uiPriority="9" w:qFormat="1"/>
     <w:lsdException w:name="heading 2" w:semiHidden="1" w:uiPriority="9" w:unhideWhenUsed="1" w:qFormat="1"/>
@@ -3726,6 +5442,11 @@
     <w:lsdException w:name="List Table 5 Dark Accent 6" w:uiPriority="50"/>
     <w:lsdException w:name="List Table 6 Colorful Accent 6" w:uiPriority="51"/>
     <w:lsdException w:name="List Table 7 Colorful Accent 6" w:uiPriority="52"/>
+    <w:lsdException w:name="Mention" w:semiHidden="1" w:unhideWhenUsed="1"/>
+    <w:lsdException w:name="Smart Hyperlink" w:semiHidden="1" w:unhideWhenUsed="1"/>
+    <w:lsdException w:name="Hashtag" w:semiHidden="1" w:unhideWhenUsed="1"/>
+    <w:lsdException w:name="Unresolved Mention" w:semiHidden="1" w:unhideWhenUsed="1"/>
+    <w:lsdException w:name="Smart Link" w:semiHidden="1" w:unhideWhenUsed="1"/>
   </w:latentStyles>
   <w:style w:type="paragraph" w:default="1" w:styleId="Normal">
     <w:name w:val="Normal"/>
@@ -3764,7 +5485,6 @@
   <w:style w:type="character" w:default="1" w:styleId="Fuentedeprrafopredeter">
     <w:name w:val="Default Paragraph Font"/>
     <w:uiPriority w:val="1"/>
-    <w:semiHidden/>
     <w:unhideWhenUsed/>
   </w:style>
   <w:style w:type="table" w:default="1" w:styleId="Tablanormal">
@@ -4035,6 +5755,19 @@
     <w:name w:val="eop"/>
     <w:basedOn w:val="Fuentedeprrafopredeter"/>
     <w:rsid w:val="00B4008E"/>
+  </w:style>
+  <w:style w:type="paragraph" w:styleId="NormalWeb">
+    <w:name w:val="Normal (Web)"/>
+    <w:basedOn w:val="Normal"/>
+    <w:uiPriority w:val="99"/>
+    <w:semiHidden/>
+    <w:unhideWhenUsed/>
+    <w:rsid w:val="007A6C9B"/>
+    <w:rPr>
+      <w:rFonts w:ascii="Times New Roman" w:hAnsi="Times New Roman" w:cs="Times New Roman"/>
+      <w:sz w:val="24"/>
+      <w:szCs w:val="24"/>
+    </w:rPr>
   </w:style>
 </w:styles>
 </file>
@@ -4335,6 +6068,21 @@
 </file>
 
 <file path=customXml/item1.xml><?xml version="1.0" encoding="utf-8"?>
+<?mso-contentType ?>
+<FormTemplates xmlns="http://schemas.microsoft.com/sharepoint/v3/contenttype/forms">
+  <Display>DocumentLibraryForm</Display>
+  <Edit>DocumentLibraryForm</Edit>
+  <New>DocumentLibraryForm</New>
+</FormTemplates>
+</file>
+
+<file path=customXml/item2.xml><?xml version="1.0" encoding="utf-8"?>
+<p:properties xmlns:p="http://schemas.microsoft.com/office/2006/metadata/properties" xmlns:xsi="http://www.w3.org/2001/XMLSchema-instance" xmlns:pc="http://schemas.microsoft.com/office/infopath/2007/PartnerControls">
+  <documentManagement/>
+</p:properties>
+</file>
+
+<file path=customXml/item3.xml><?xml version="1.0" encoding="utf-8"?>
 <ct:contentTypeSchema xmlns:ct="http://schemas.microsoft.com/office/2006/metadata/contentType" xmlns:ma="http://schemas.microsoft.com/office/2006/metadata/properties/metaAttributes" ct:_="" ma:_="" ma:contentTypeName="Documento" ma:contentTypeID="0x010100E96778489EE7714D8BD12CC105EB918B" ma:contentTypeVersion="2" ma:contentTypeDescription="Crear nuevo documento." ma:contentTypeScope="" ma:versionID="416c5c7ae9b5d54d83875cd3c65194e3">
   <xsd:schema xmlns:xsd="http://www.w3.org/2001/XMLSchema" xmlns:xs="http://www.w3.org/2001/XMLSchema" xmlns:p="http://schemas.microsoft.com/office/2006/metadata/properties" xmlns:ns2="126e8a1c-9ea9-435a-ac89-d06c80d62e30" targetNamespace="http://schemas.microsoft.com/office/2006/metadata/properties" ma:root="true" ma:fieldsID="70a237c842677bd850644f8595079f5e" ns2:_="">
     <xsd:import namespace="126e8a1c-9ea9-435a-ac89-d06c80d62e30"/>
@@ -4466,26 +6214,28 @@
 </ct:contentTypeSchema>
 </file>
 
-<file path=customXml/item2.xml><?xml version="1.0" encoding="utf-8"?>
-<p:properties xmlns:p="http://schemas.microsoft.com/office/2006/metadata/properties" xmlns:xsi="http://www.w3.org/2001/XMLSchema-instance" xmlns:pc="http://schemas.microsoft.com/office/infopath/2007/PartnerControls">
-  <documentManagement/>
-</p:properties>
-</file>
-
-<file path=customXml/item3.xml><?xml version="1.0" encoding="utf-8"?>
-<?mso-contentType ?>
-<FormTemplates xmlns="http://schemas.microsoft.com/sharepoint/v3/contenttype/forms">
-  <Display>DocumentLibraryForm</Display>
-  <Edit>DocumentLibraryForm</Edit>
-  <New>DocumentLibraryForm</New>
-</FormTemplates>
-</file>
-
 <file path=customXml/item4.xml><?xml version="1.0" encoding="utf-8"?>
 <b:Sources xmlns:b="http://schemas.openxmlformats.org/officeDocument/2006/bibliography" xmlns="http://schemas.openxmlformats.org/officeDocument/2006/bibliography" SelectedStyle="\APASixthEditionOfficeOnline.xsl" StyleName="APA" Version="6"/>
 </file>
 
 <file path=customXml/itemProps1.xml><?xml version="1.0" encoding="utf-8"?>
+<ds:datastoreItem xmlns:ds="http://schemas.openxmlformats.org/officeDocument/2006/customXml" ds:itemID="{DB26575A-B7B3-4412-B642-D3B0845180CC}">
+  <ds:schemaRefs>
+    <ds:schemaRef ds:uri="http://schemas.microsoft.com/sharepoint/v3/contenttype/forms"/>
+  </ds:schemaRefs>
+</ds:datastoreItem>
+</file>
+
+<file path=customXml/itemProps2.xml><?xml version="1.0" encoding="utf-8"?>
+<ds:datastoreItem xmlns:ds="http://schemas.openxmlformats.org/officeDocument/2006/customXml" ds:itemID="{372B79FC-6971-4544-98C5-83069028712A}">
+  <ds:schemaRefs>
+    <ds:schemaRef ds:uri="http://schemas.microsoft.com/office/2006/metadata/properties"/>
+    <ds:schemaRef ds:uri="http://schemas.microsoft.com/office/infopath/2007/PartnerControls"/>
+  </ds:schemaRefs>
+</ds:datastoreItem>
+</file>
+
+<file path=customXml/itemProps3.xml><?xml version="1.0" encoding="utf-8"?>
 <ds:datastoreItem xmlns:ds="http://schemas.openxmlformats.org/officeDocument/2006/customXml" ds:itemID="{1A4E63CB-0BBC-477D-B96D-0B1E89CFECED}">
   <ds:schemaRefs>
     <ds:schemaRef ds:uri="http://schemas.microsoft.com/office/2006/metadata/contentType"/>
@@ -4503,30 +6253,6 @@
 </ds:datastoreItem>
 </file>
 
-<file path=customXml/itemProps2.xml><?xml version="1.0" encoding="utf-8"?>
-<ds:datastoreItem xmlns:ds="http://schemas.openxmlformats.org/officeDocument/2006/customXml" ds:itemID="{372B79FC-6971-4544-98C5-83069028712A}">
-  <ds:schemaRefs>
-    <ds:schemaRef ds:uri="http://purl.org/dc/dcmitype/"/>
-    <ds:schemaRef ds:uri="http://purl.org/dc/elements/1.1/"/>
-    <ds:schemaRef ds:uri="http://www.w3.org/XML/1998/namespace"/>
-    <ds:schemaRef ds:uri="126e8a1c-9ea9-435a-ac89-d06c80d62e30"/>
-    <ds:schemaRef ds:uri="http://schemas.microsoft.com/office/2006/documentManagement/types"/>
-    <ds:schemaRef ds:uri="http://purl.org/dc/terms/"/>
-    <ds:schemaRef ds:uri="http://schemas.microsoft.com/office/infopath/2007/PartnerControls"/>
-    <ds:schemaRef ds:uri="http://schemas.openxmlformats.org/package/2006/metadata/core-properties"/>
-    <ds:schemaRef ds:uri="http://schemas.microsoft.com/office/2006/metadata/properties"/>
-  </ds:schemaRefs>
-</ds:datastoreItem>
-</file>
-
-<file path=customXml/itemProps3.xml><?xml version="1.0" encoding="utf-8"?>
-<ds:datastoreItem xmlns:ds="http://schemas.openxmlformats.org/officeDocument/2006/customXml" ds:itemID="{DB26575A-B7B3-4412-B642-D3B0845180CC}">
-  <ds:schemaRefs>
-    <ds:schemaRef ds:uri="http://schemas.microsoft.com/sharepoint/v3/contenttype/forms"/>
-  </ds:schemaRefs>
-</ds:datastoreItem>
-</file>
-
 <file path=customXml/itemProps4.xml><?xml version="1.0" encoding="utf-8"?>
 <ds:datastoreItem xmlns:ds="http://schemas.openxmlformats.org/officeDocument/2006/customXml" ds:itemID="{BDCED711-E314-4C22-B587-D275DD8897EC}">
   <ds:schemaRefs>

</xml_diff>